<commit_message>
docs: add plausibility audit tables to study guide
Section 5.12: top 20 CompGCN predictions per disease classified by
therapeutic plausibility. 89.2% plausible/ambiguous, 10.8% implausible.
Detail tables for heart disease, hypertension, and myocardial infarction.
Hypertension noisiest at 25% implausible (oncology hub drugs).
</commit_message>
<xml_diff>
--- a/docs/CardioKB_Session_Study_Guide_July10.docx
+++ b/docs/CardioKB_Session_Study_Guide_July10.docx
@@ -329,6 +329,4234 @@
         <w:t>5.11 Prediction Coverage Analysis</w:t>
       </w:r>
     </w:p>
+    <w:p>
+      <w:pPr>
+        <w:pStyle w:val="Heading2"/>
+      </w:pPr>
+      <w:r>
+        <w:t>5.12 Plausibility Audit — Top 20 Predictions per Disease</w:t>
+      </w:r>
+    </w:p>
+    <w:p>
+      <w:r>
+        <w:t>For the top 6 diseases by prediction count, the top 20 predicted drugs by confidence were classified by their primary known therapeutic class (from existing drugTreatsDisease edges and pharmacologic class data). Each drug was flagged as plausible (has CVD-relevant pharmacologic class or existing curated CVD treatments), implausible (primary therapeutic area is non-CVD with no mechanistic link, e.g., oncology, dermatology, CNS/psychiatry), or ambiguous (indirect link possible, e.g., anemia drugs with vascular effects).</w:t>
+      </w:r>
+    </w:p>
+    <w:tbl>
+      <w:tblPr>
+        <w:tblStyle w:val="LightGrid-Accent1"/>
+        <w:tblW w:type="auto" w:w="0"/>
+        <w:jc w:val="center"/>
+        <w:tblLook w:firstColumn="1" w:firstRow="1" w:lastColumn="0" w:lastRow="0" w:noHBand="0" w:noVBand="1" w:val="04A0"/>
+      </w:tblPr>
+      <w:tblGrid>
+        <w:gridCol w:w="1440"/>
+        <w:gridCol w:w="1440"/>
+        <w:gridCol w:w="1440"/>
+        <w:gridCol w:w="1440"/>
+        <w:gridCol w:w="1440"/>
+        <w:gridCol w:w="1440"/>
+      </w:tblGrid>
+      <w:tr>
+        <w:tc>
+          <w:tcPr>
+            <w:tcW w:type="dxa" w:w="2551"/>
+          </w:tcPr>
+          <w:p>
+            <w:r>
+              <w:rPr>
+                <w:b/>
+                <w:sz w:val="18"/>
+              </w:rPr>
+              <w:t>Disease</w:t>
+            </w:r>
+          </w:p>
+        </w:tc>
+        <w:tc>
+          <w:tcPr>
+            <w:tcW w:type="dxa" w:w="680"/>
+          </w:tcPr>
+          <w:p>
+            <w:r>
+              <w:rPr>
+                <w:b/>
+                <w:sz w:val="18"/>
+              </w:rPr>
+              <w:t>Total</w:t>
+            </w:r>
+          </w:p>
+        </w:tc>
+        <w:tc>
+          <w:tcPr>
+            <w:tcW w:type="dxa" w:w="1134"/>
+          </w:tcPr>
+          <w:p>
+            <w:r>
+              <w:rPr>
+                <w:b/>
+                <w:sz w:val="18"/>
+              </w:rPr>
+              <w:t>Plausible</w:t>
+            </w:r>
+          </w:p>
+        </w:tc>
+        <w:tc>
+          <w:tcPr>
+            <w:tcW w:type="dxa" w:w="1134"/>
+          </w:tcPr>
+          <w:p>
+            <w:r>
+              <w:rPr>
+                <w:b/>
+                <w:sz w:val="18"/>
+              </w:rPr>
+              <w:t>Implausible</w:t>
+            </w:r>
+          </w:p>
+        </w:tc>
+        <w:tc>
+          <w:tcPr>
+            <w:tcW w:type="dxa" w:w="1020"/>
+          </w:tcPr>
+          <w:p>
+            <w:r>
+              <w:rPr>
+                <w:b/>
+                <w:sz w:val="18"/>
+              </w:rPr>
+              <w:t>Ambiguous</w:t>
+            </w:r>
+          </w:p>
+        </w:tc>
+        <w:tc>
+          <w:tcPr>
+            <w:tcW w:type="dxa" w:w="1134"/>
+          </w:tcPr>
+          <w:p>
+            <w:r>
+              <w:rPr>
+                <w:b/>
+                <w:sz w:val="18"/>
+              </w:rPr>
+              <w:t>% Implausible</w:t>
+            </w:r>
+          </w:p>
+        </w:tc>
+      </w:tr>
+      <w:tr>
+        <w:tc>
+          <w:tcPr>
+            <w:tcW w:type="dxa" w:w="2551"/>
+          </w:tcPr>
+          <w:p>
+            <w:r>
+              <w:rPr>
+                <w:sz w:val="18"/>
+              </w:rPr>
+              <w:t>Heart disease</w:t>
+            </w:r>
+          </w:p>
+        </w:tc>
+        <w:tc>
+          <w:tcPr>
+            <w:tcW w:type="dxa" w:w="680"/>
+          </w:tcPr>
+          <w:p>
+            <w:r>
+              <w:rPr>
+                <w:sz w:val="18"/>
+              </w:rPr>
+              <w:t>20</w:t>
+            </w:r>
+          </w:p>
+        </w:tc>
+        <w:tc>
+          <w:tcPr>
+            <w:tcW w:type="dxa" w:w="1134"/>
+          </w:tcPr>
+          <w:p>
+            <w:r>
+              <w:rPr>
+                <w:sz w:val="18"/>
+              </w:rPr>
+              <w:t>19 (95%)</w:t>
+            </w:r>
+          </w:p>
+        </w:tc>
+        <w:tc>
+          <w:tcPr>
+            <w:tcW w:type="dxa" w:w="1134"/>
+          </w:tcPr>
+          <w:p>
+            <w:r>
+              <w:rPr>
+                <w:sz w:val="18"/>
+              </w:rPr>
+              <w:t>1 (5%)</w:t>
+            </w:r>
+          </w:p>
+        </w:tc>
+        <w:tc>
+          <w:tcPr>
+            <w:tcW w:type="dxa" w:w="1020"/>
+          </w:tcPr>
+          <w:p>
+            <w:r>
+              <w:rPr>
+                <w:sz w:val="18"/>
+              </w:rPr>
+              <w:t>0</w:t>
+            </w:r>
+          </w:p>
+        </w:tc>
+        <w:tc>
+          <w:tcPr>
+            <w:tcW w:type="dxa" w:w="1134"/>
+          </w:tcPr>
+          <w:p>
+            <w:r>
+              <w:rPr>
+                <w:sz w:val="18"/>
+              </w:rPr>
+              <w:t>5%</w:t>
+            </w:r>
+          </w:p>
+        </w:tc>
+      </w:tr>
+      <w:tr>
+        <w:tc>
+          <w:tcPr>
+            <w:tcW w:type="dxa" w:w="2551"/>
+          </w:tcPr>
+          <w:p>
+            <w:r>
+              <w:rPr>
+                <w:sz w:val="18"/>
+              </w:rPr>
+              <w:t>Coronary artery disease</w:t>
+            </w:r>
+          </w:p>
+        </w:tc>
+        <w:tc>
+          <w:tcPr>
+            <w:tcW w:type="dxa" w:w="680"/>
+          </w:tcPr>
+          <w:p>
+            <w:r>
+              <w:rPr>
+                <w:sz w:val="18"/>
+              </w:rPr>
+              <w:t>20</w:t>
+            </w:r>
+          </w:p>
+        </w:tc>
+        <w:tc>
+          <w:tcPr>
+            <w:tcW w:type="dxa" w:w="1134"/>
+          </w:tcPr>
+          <w:p>
+            <w:r>
+              <w:rPr>
+                <w:sz w:val="18"/>
+              </w:rPr>
+              <w:t>18 (90%)</w:t>
+            </w:r>
+          </w:p>
+        </w:tc>
+        <w:tc>
+          <w:tcPr>
+            <w:tcW w:type="dxa" w:w="1134"/>
+          </w:tcPr>
+          <w:p>
+            <w:r>
+              <w:rPr>
+                <w:sz w:val="18"/>
+              </w:rPr>
+              <w:t>0 (0%)</w:t>
+            </w:r>
+          </w:p>
+        </w:tc>
+        <w:tc>
+          <w:tcPr>
+            <w:tcW w:type="dxa" w:w="1020"/>
+          </w:tcPr>
+          <w:p>
+            <w:r>
+              <w:rPr>
+                <w:sz w:val="18"/>
+              </w:rPr>
+              <w:t>2</w:t>
+            </w:r>
+          </w:p>
+        </w:tc>
+        <w:tc>
+          <w:tcPr>
+            <w:tcW w:type="dxa" w:w="1134"/>
+          </w:tcPr>
+          <w:p>
+            <w:r>
+              <w:rPr>
+                <w:sz w:val="18"/>
+              </w:rPr>
+              <w:t>0%</w:t>
+            </w:r>
+          </w:p>
+        </w:tc>
+      </w:tr>
+      <w:tr>
+        <w:tc>
+          <w:tcPr>
+            <w:tcW w:type="dxa" w:w="2551"/>
+          </w:tcPr>
+          <w:p>
+            <w:r>
+              <w:rPr>
+                <w:sz w:val="18"/>
+              </w:rPr>
+              <w:t>Hypertension</w:t>
+            </w:r>
+          </w:p>
+        </w:tc>
+        <w:tc>
+          <w:tcPr>
+            <w:tcW w:type="dxa" w:w="680"/>
+          </w:tcPr>
+          <w:p>
+            <w:r>
+              <w:rPr>
+                <w:sz w:val="18"/>
+              </w:rPr>
+              <w:t>20</w:t>
+            </w:r>
+          </w:p>
+        </w:tc>
+        <w:tc>
+          <w:tcPr>
+            <w:tcW w:type="dxa" w:w="1134"/>
+          </w:tcPr>
+          <w:p>
+            <w:r>
+              <w:rPr>
+                <w:sz w:val="18"/>
+              </w:rPr>
+              <w:t>14 (70%)</w:t>
+            </w:r>
+          </w:p>
+        </w:tc>
+        <w:tc>
+          <w:tcPr>
+            <w:tcW w:type="dxa" w:w="1134"/>
+          </w:tcPr>
+          <w:p>
+            <w:r>
+              <w:rPr>
+                <w:sz w:val="18"/>
+              </w:rPr>
+              <w:t>5 (25%)</w:t>
+            </w:r>
+          </w:p>
+        </w:tc>
+        <w:tc>
+          <w:tcPr>
+            <w:tcW w:type="dxa" w:w="1020"/>
+          </w:tcPr>
+          <w:p>
+            <w:r>
+              <w:rPr>
+                <w:sz w:val="18"/>
+              </w:rPr>
+              <w:t>1</w:t>
+            </w:r>
+          </w:p>
+        </w:tc>
+        <w:tc>
+          <w:tcPr>
+            <w:tcW w:type="dxa" w:w="1134"/>
+          </w:tcPr>
+          <w:p>
+            <w:r>
+              <w:rPr>
+                <w:sz w:val="18"/>
+              </w:rPr>
+              <w:t>25%</w:t>
+            </w:r>
+          </w:p>
+        </w:tc>
+      </w:tr>
+      <w:tr>
+        <w:tc>
+          <w:tcPr>
+            <w:tcW w:type="dxa" w:w="2551"/>
+          </w:tcPr>
+          <w:p>
+            <w:r>
+              <w:rPr>
+                <w:sz w:val="18"/>
+              </w:rPr>
+              <w:t>Atherosclerosis</w:t>
+            </w:r>
+          </w:p>
+        </w:tc>
+        <w:tc>
+          <w:tcPr>
+            <w:tcW w:type="dxa" w:w="680"/>
+          </w:tcPr>
+          <w:p>
+            <w:r>
+              <w:rPr>
+                <w:sz w:val="18"/>
+              </w:rPr>
+              <w:t>20</w:t>
+            </w:r>
+          </w:p>
+        </w:tc>
+        <w:tc>
+          <w:tcPr>
+            <w:tcW w:type="dxa" w:w="1134"/>
+          </w:tcPr>
+          <w:p>
+            <w:r>
+              <w:rPr>
+                <w:sz w:val="18"/>
+              </w:rPr>
+              <w:t>18 (90%)</w:t>
+            </w:r>
+          </w:p>
+        </w:tc>
+        <w:tc>
+          <w:tcPr>
+            <w:tcW w:type="dxa" w:w="1134"/>
+          </w:tcPr>
+          <w:p>
+            <w:r>
+              <w:rPr>
+                <w:sz w:val="18"/>
+              </w:rPr>
+              <w:t>2 (10%)</w:t>
+            </w:r>
+          </w:p>
+        </w:tc>
+        <w:tc>
+          <w:tcPr>
+            <w:tcW w:type="dxa" w:w="1020"/>
+          </w:tcPr>
+          <w:p>
+            <w:r>
+              <w:rPr>
+                <w:sz w:val="18"/>
+              </w:rPr>
+              <w:t>0</w:t>
+            </w:r>
+          </w:p>
+        </w:tc>
+        <w:tc>
+          <w:tcPr>
+            <w:tcW w:type="dxa" w:w="1134"/>
+          </w:tcPr>
+          <w:p>
+            <w:r>
+              <w:rPr>
+                <w:sz w:val="18"/>
+              </w:rPr>
+              <w:t>10%</w:t>
+            </w:r>
+          </w:p>
+        </w:tc>
+      </w:tr>
+      <w:tr>
+        <w:tc>
+          <w:tcPr>
+            <w:tcW w:type="dxa" w:w="2551"/>
+          </w:tcPr>
+          <w:p>
+            <w:r>
+              <w:rPr>
+                <w:sz w:val="18"/>
+              </w:rPr>
+              <w:t>Congestive heart failure</w:t>
+            </w:r>
+          </w:p>
+        </w:tc>
+        <w:tc>
+          <w:tcPr>
+            <w:tcW w:type="dxa" w:w="680"/>
+          </w:tcPr>
+          <w:p>
+            <w:r>
+              <w:rPr>
+                <w:sz w:val="18"/>
+              </w:rPr>
+              <w:t>20</w:t>
+            </w:r>
+          </w:p>
+        </w:tc>
+        <w:tc>
+          <w:tcPr>
+            <w:tcW w:type="dxa" w:w="1134"/>
+          </w:tcPr>
+          <w:p>
+            <w:r>
+              <w:rPr>
+                <w:sz w:val="18"/>
+              </w:rPr>
+              <w:t>18 (90%)</w:t>
+            </w:r>
+          </w:p>
+        </w:tc>
+        <w:tc>
+          <w:tcPr>
+            <w:tcW w:type="dxa" w:w="1134"/>
+          </w:tcPr>
+          <w:p>
+            <w:r>
+              <w:rPr>
+                <w:sz w:val="18"/>
+              </w:rPr>
+              <w:t>1 (5%)</w:t>
+            </w:r>
+          </w:p>
+        </w:tc>
+        <w:tc>
+          <w:tcPr>
+            <w:tcW w:type="dxa" w:w="1020"/>
+          </w:tcPr>
+          <w:p>
+            <w:r>
+              <w:rPr>
+                <w:sz w:val="18"/>
+              </w:rPr>
+              <w:t>1</w:t>
+            </w:r>
+          </w:p>
+        </w:tc>
+        <w:tc>
+          <w:tcPr>
+            <w:tcW w:type="dxa" w:w="1134"/>
+          </w:tcPr>
+          <w:p>
+            <w:r>
+              <w:rPr>
+                <w:sz w:val="18"/>
+              </w:rPr>
+              <w:t>5%</w:t>
+            </w:r>
+          </w:p>
+        </w:tc>
+      </w:tr>
+      <w:tr>
+        <w:tc>
+          <w:tcPr>
+            <w:tcW w:type="dxa" w:w="2551"/>
+          </w:tcPr>
+          <w:p>
+            <w:r>
+              <w:rPr>
+                <w:sz w:val="18"/>
+              </w:rPr>
+              <w:t>Myocardial infarction</w:t>
+            </w:r>
+          </w:p>
+        </w:tc>
+        <w:tc>
+          <w:tcPr>
+            <w:tcW w:type="dxa" w:w="680"/>
+          </w:tcPr>
+          <w:p>
+            <w:r>
+              <w:rPr>
+                <w:sz w:val="18"/>
+              </w:rPr>
+              <w:t>20</w:t>
+            </w:r>
+          </w:p>
+        </w:tc>
+        <w:tc>
+          <w:tcPr>
+            <w:tcW w:type="dxa" w:w="1134"/>
+          </w:tcPr>
+          <w:p>
+            <w:r>
+              <w:rPr>
+                <w:sz w:val="18"/>
+              </w:rPr>
+              <w:t>15 (75%)</w:t>
+            </w:r>
+          </w:p>
+        </w:tc>
+        <w:tc>
+          <w:tcPr>
+            <w:tcW w:type="dxa" w:w="1134"/>
+          </w:tcPr>
+          <w:p>
+            <w:r>
+              <w:rPr>
+                <w:sz w:val="18"/>
+              </w:rPr>
+              <w:t>4 (20%)</w:t>
+            </w:r>
+          </w:p>
+        </w:tc>
+        <w:tc>
+          <w:tcPr>
+            <w:tcW w:type="dxa" w:w="1020"/>
+          </w:tcPr>
+          <w:p>
+            <w:r>
+              <w:rPr>
+                <w:sz w:val="18"/>
+              </w:rPr>
+              <w:t>1</w:t>
+            </w:r>
+          </w:p>
+        </w:tc>
+        <w:tc>
+          <w:tcPr>
+            <w:tcW w:type="dxa" w:w="1134"/>
+          </w:tcPr>
+          <w:p>
+            <w:r>
+              <w:rPr>
+                <w:sz w:val="18"/>
+              </w:rPr>
+              <w:t>20%</w:t>
+            </w:r>
+          </w:p>
+        </w:tc>
+      </w:tr>
+      <w:tr>
+        <w:tc>
+          <w:tcPr>
+            <w:tcW w:type="dxa" w:w="2551"/>
+          </w:tcPr>
+          <w:p>
+            <w:r>
+              <w:rPr>
+                <w:b/>
+                <w:sz w:val="18"/>
+              </w:rPr>
+              <w:t>OVERALL</w:t>
+            </w:r>
+          </w:p>
+        </w:tc>
+        <w:tc>
+          <w:tcPr>
+            <w:tcW w:type="dxa" w:w="680"/>
+          </w:tcPr>
+          <w:p>
+            <w:r>
+              <w:rPr>
+                <w:b/>
+                <w:sz w:val="18"/>
+              </w:rPr>
+              <w:t>120</w:t>
+            </w:r>
+          </w:p>
+        </w:tc>
+        <w:tc>
+          <w:tcPr>
+            <w:tcW w:type="dxa" w:w="1134"/>
+          </w:tcPr>
+          <w:p>
+            <w:r>
+              <w:rPr>
+                <w:b/>
+                <w:sz w:val="18"/>
+              </w:rPr>
+              <w:t>102 (85%)</w:t>
+            </w:r>
+          </w:p>
+        </w:tc>
+        <w:tc>
+          <w:tcPr>
+            <w:tcW w:type="dxa" w:w="1134"/>
+          </w:tcPr>
+          <w:p>
+            <w:r>
+              <w:rPr>
+                <w:b/>
+                <w:sz w:val="18"/>
+              </w:rPr>
+              <w:t>13 (10.8%)</w:t>
+            </w:r>
+          </w:p>
+        </w:tc>
+        <w:tc>
+          <w:tcPr>
+            <w:tcW w:type="dxa" w:w="1020"/>
+          </w:tcPr>
+          <w:p>
+            <w:r>
+              <w:rPr>
+                <w:b/>
+                <w:sz w:val="18"/>
+              </w:rPr>
+              <w:t>5 (4.2%)</w:t>
+            </w:r>
+          </w:p>
+        </w:tc>
+        <w:tc>
+          <w:tcPr>
+            <w:tcW w:type="dxa" w:w="1134"/>
+          </w:tcPr>
+          <w:p>
+            <w:r>
+              <w:rPr>
+                <w:b/>
+                <w:sz w:val="18"/>
+              </w:rPr>
+              <w:t>10.8%</w:t>
+            </w:r>
+          </w:p>
+        </w:tc>
+      </w:tr>
+    </w:tbl>
+    <w:p/>
+    <w:p>
+      <w:r>
+        <w:rPr>
+          <w:b/>
+          <w:sz w:val="22"/>
+        </w:rPr>
+        <w:t>Top 20 Predictions — Heart Disease</w:t>
+      </w:r>
+    </w:p>
+    <w:tbl>
+      <w:tblPr>
+        <w:tblStyle w:val="LightGrid-Accent1"/>
+        <w:tblW w:type="auto" w:w="0"/>
+        <w:jc w:val="center"/>
+        <w:tblLook w:firstColumn="1" w:firstRow="1" w:lastColumn="0" w:lastRow="0" w:noHBand="0" w:noVBand="1" w:val="04A0"/>
+      </w:tblPr>
+      <w:tblGrid>
+        <w:gridCol w:w="2160"/>
+        <w:gridCol w:w="2160"/>
+        <w:gridCol w:w="2160"/>
+        <w:gridCol w:w="2160"/>
+      </w:tblGrid>
+      <w:tr>
+        <w:tc>
+          <w:tcPr>
+            <w:tcW w:type="dxa" w:w="2268"/>
+          </w:tcPr>
+          <w:p>
+            <w:r>
+              <w:rPr>
+                <w:b/>
+                <w:sz w:val="16"/>
+              </w:rPr>
+              <w:t>Drug</w:t>
+            </w:r>
+          </w:p>
+        </w:tc>
+        <w:tc>
+          <w:tcPr>
+            <w:tcW w:type="dxa" w:w="1020"/>
+          </w:tcPr>
+          <w:p>
+            <w:r>
+              <w:rPr>
+                <w:b/>
+                <w:sz w:val="16"/>
+              </w:rPr>
+              <w:t>Confidence</w:t>
+            </w:r>
+          </w:p>
+        </w:tc>
+        <w:tc>
+          <w:tcPr>
+            <w:tcW w:type="dxa" w:w="2835"/>
+          </w:tcPr>
+          <w:p>
+            <w:r>
+              <w:rPr>
+                <w:b/>
+                <w:sz w:val="16"/>
+              </w:rPr>
+              <w:t>Basis</w:t>
+            </w:r>
+          </w:p>
+        </w:tc>
+        <w:tc>
+          <w:tcPr>
+            <w:tcW w:type="dxa" w:w="1417"/>
+          </w:tcPr>
+          <w:p>
+            <w:r>
+              <w:rPr>
+                <w:b/>
+                <w:sz w:val="16"/>
+              </w:rPr>
+              <w:t>Verdict</w:t>
+            </w:r>
+          </w:p>
+        </w:tc>
+      </w:tr>
+      <w:tr>
+        <w:tc>
+          <w:tcPr>
+            <w:tcW w:type="dxa" w:w="2268"/>
+          </w:tcPr>
+          <w:p>
+            <w:r>
+              <w:rPr>
+                <w:sz w:val="16"/>
+              </w:rPr>
+              <w:t>temocapril hydrochloride</w:t>
+            </w:r>
+          </w:p>
+        </w:tc>
+        <w:tc>
+          <w:tcPr>
+            <w:tcW w:type="dxa" w:w="1020"/>
+          </w:tcPr>
+          <w:p>
+            <w:r>
+              <w:rPr>
+                <w:sz w:val="16"/>
+              </w:rPr>
+              <w:t>0.9912</w:t>
+            </w:r>
+          </w:p>
+        </w:tc>
+        <w:tc>
+          <w:tcPr>
+            <w:tcW w:type="dxa" w:w="2835"/>
+          </w:tcPr>
+          <w:p>
+            <w:r>
+              <w:rPr>
+                <w:sz w:val="16"/>
+              </w:rPr>
+              <w:t>curated CVD treatments</w:t>
+            </w:r>
+          </w:p>
+        </w:tc>
+        <w:tc>
+          <w:tcPr>
+            <w:tcW w:type="dxa" w:w="1417"/>
+          </w:tcPr>
+          <w:p>
+            <w:r>
+              <w:rPr>
+                <w:sz w:val="16"/>
+              </w:rPr>
+              <w:t>PLAUSIBLE</w:t>
+            </w:r>
+          </w:p>
+        </w:tc>
+      </w:tr>
+      <w:tr>
+        <w:tc>
+          <w:tcPr>
+            <w:tcW w:type="dxa" w:w="2268"/>
+          </w:tcPr>
+          <w:p>
+            <w:r>
+              <w:rPr>
+                <w:sz w:val="16"/>
+              </w:rPr>
+              <w:t>Bempedoic acid</w:t>
+            </w:r>
+          </w:p>
+        </w:tc>
+        <w:tc>
+          <w:tcPr>
+            <w:tcW w:type="dxa" w:w="1020"/>
+          </w:tcPr>
+          <w:p>
+            <w:r>
+              <w:rPr>
+                <w:sz w:val="16"/>
+              </w:rPr>
+              <w:t>0.9912</w:t>
+            </w:r>
+          </w:p>
+        </w:tc>
+        <w:tc>
+          <w:tcPr>
+            <w:tcW w:type="dxa" w:w="2835"/>
+          </w:tcPr>
+          <w:p>
+            <w:r>
+              <w:rPr>
+                <w:sz w:val="16"/>
+              </w:rPr>
+              <w:t>curated CVD treatments</w:t>
+            </w:r>
+          </w:p>
+        </w:tc>
+        <w:tc>
+          <w:tcPr>
+            <w:tcW w:type="dxa" w:w="1417"/>
+          </w:tcPr>
+          <w:p>
+            <w:r>
+              <w:rPr>
+                <w:sz w:val="16"/>
+              </w:rPr>
+              <w:t>PLAUSIBLE</w:t>
+            </w:r>
+          </w:p>
+        </w:tc>
+      </w:tr>
+      <w:tr>
+        <w:tc>
+          <w:tcPr>
+            <w:tcW w:type="dxa" w:w="2268"/>
+          </w:tcPr>
+          <w:p>
+            <w:r>
+              <w:rPr>
+                <w:sz w:val="16"/>
+              </w:rPr>
+              <w:t>Nitroglycerin</w:t>
+            </w:r>
+          </w:p>
+        </w:tc>
+        <w:tc>
+          <w:tcPr>
+            <w:tcW w:type="dxa" w:w="1020"/>
+          </w:tcPr>
+          <w:p>
+            <w:r>
+              <w:rPr>
+                <w:sz w:val="16"/>
+              </w:rPr>
+              <w:t>0.9910</w:t>
+            </w:r>
+          </w:p>
+        </w:tc>
+        <w:tc>
+          <w:tcPr>
+            <w:tcW w:type="dxa" w:w="2835"/>
+          </w:tcPr>
+          <w:p>
+            <w:r>
+              <w:rPr>
+                <w:sz w:val="16"/>
+              </w:rPr>
+              <w:t>curated CVD treatments</w:t>
+            </w:r>
+          </w:p>
+        </w:tc>
+        <w:tc>
+          <w:tcPr>
+            <w:tcW w:type="dxa" w:w="1417"/>
+          </w:tcPr>
+          <w:p>
+            <w:r>
+              <w:rPr>
+                <w:sz w:val="16"/>
+              </w:rPr>
+              <w:t>PLAUSIBLE</w:t>
+            </w:r>
+          </w:p>
+        </w:tc>
+      </w:tr>
+      <w:tr>
+        <w:tc>
+          <w:tcPr>
+            <w:tcW w:type="dxa" w:w="2268"/>
+          </w:tcPr>
+          <w:p>
+            <w:r>
+              <w:rPr>
+                <w:sz w:val="16"/>
+              </w:rPr>
+              <w:t>Atenolol</w:t>
+            </w:r>
+          </w:p>
+        </w:tc>
+        <w:tc>
+          <w:tcPr>
+            <w:tcW w:type="dxa" w:w="1020"/>
+          </w:tcPr>
+          <w:p>
+            <w:r>
+              <w:rPr>
+                <w:sz w:val="16"/>
+              </w:rPr>
+              <w:t>0.9910</w:t>
+            </w:r>
+          </w:p>
+        </w:tc>
+        <w:tc>
+          <w:tcPr>
+            <w:tcW w:type="dxa" w:w="2835"/>
+          </w:tcPr>
+          <w:p>
+            <w:r>
+              <w:rPr>
+                <w:sz w:val="16"/>
+              </w:rPr>
+              <w:t>curated CVD treatments</w:t>
+            </w:r>
+          </w:p>
+        </w:tc>
+        <w:tc>
+          <w:tcPr>
+            <w:tcW w:type="dxa" w:w="1417"/>
+          </w:tcPr>
+          <w:p>
+            <w:r>
+              <w:rPr>
+                <w:sz w:val="16"/>
+              </w:rPr>
+              <w:t>PLAUSIBLE</w:t>
+            </w:r>
+          </w:p>
+        </w:tc>
+      </w:tr>
+      <w:tr>
+        <w:tc>
+          <w:tcPr>
+            <w:tcW w:type="dxa" w:w="2268"/>
+          </w:tcPr>
+          <w:p>
+            <w:r>
+              <w:rPr>
+                <w:sz w:val="16"/>
+              </w:rPr>
+              <w:t>Icosapent ethyl</w:t>
+            </w:r>
+          </w:p>
+        </w:tc>
+        <w:tc>
+          <w:tcPr>
+            <w:tcW w:type="dxa" w:w="1020"/>
+          </w:tcPr>
+          <w:p>
+            <w:r>
+              <w:rPr>
+                <w:sz w:val="16"/>
+              </w:rPr>
+              <w:t>0.9910</w:t>
+            </w:r>
+          </w:p>
+        </w:tc>
+        <w:tc>
+          <w:tcPr>
+            <w:tcW w:type="dxa" w:w="2835"/>
+          </w:tcPr>
+          <w:p>
+            <w:r>
+              <w:rPr>
+                <w:sz w:val="16"/>
+              </w:rPr>
+              <w:t>curated CVD treatments</w:t>
+            </w:r>
+          </w:p>
+        </w:tc>
+        <w:tc>
+          <w:tcPr>
+            <w:tcW w:type="dxa" w:w="1417"/>
+          </w:tcPr>
+          <w:p>
+            <w:r>
+              <w:rPr>
+                <w:sz w:val="16"/>
+              </w:rPr>
+              <w:t>PLAUSIBLE</w:t>
+            </w:r>
+          </w:p>
+        </w:tc>
+      </w:tr>
+      <w:tr>
+        <w:tc>
+          <w:tcPr>
+            <w:tcW w:type="dxa" w:w="2268"/>
+          </w:tcPr>
+          <w:p>
+            <w:r>
+              <w:rPr>
+                <w:sz w:val="16"/>
+              </w:rPr>
+              <w:t>Hydrochlorothiazide</w:t>
+            </w:r>
+          </w:p>
+        </w:tc>
+        <w:tc>
+          <w:tcPr>
+            <w:tcW w:type="dxa" w:w="1020"/>
+          </w:tcPr>
+          <w:p>
+            <w:r>
+              <w:rPr>
+                <w:sz w:val="16"/>
+              </w:rPr>
+              <w:t>0.9910</w:t>
+            </w:r>
+          </w:p>
+        </w:tc>
+        <w:tc>
+          <w:tcPr>
+            <w:tcW w:type="dxa" w:w="2835"/>
+          </w:tcPr>
+          <w:p>
+            <w:r>
+              <w:rPr>
+                <w:sz w:val="16"/>
+              </w:rPr>
+              <w:t>curated CVD treatments</w:t>
+            </w:r>
+          </w:p>
+        </w:tc>
+        <w:tc>
+          <w:tcPr>
+            <w:tcW w:type="dxa" w:w="1417"/>
+          </w:tcPr>
+          <w:p>
+            <w:r>
+              <w:rPr>
+                <w:sz w:val="16"/>
+              </w:rPr>
+              <w:t>PLAUSIBLE</w:t>
+            </w:r>
+          </w:p>
+        </w:tc>
+      </w:tr>
+      <w:tr>
+        <w:tc>
+          <w:tcPr>
+            <w:tcW w:type="dxa" w:w="2268"/>
+          </w:tcPr>
+          <w:p>
+            <w:r>
+              <w:rPr>
+                <w:sz w:val="16"/>
+              </w:rPr>
+              <w:t>Warfarin</w:t>
+            </w:r>
+          </w:p>
+        </w:tc>
+        <w:tc>
+          <w:tcPr>
+            <w:tcW w:type="dxa" w:w="1020"/>
+          </w:tcPr>
+          <w:p>
+            <w:r>
+              <w:rPr>
+                <w:sz w:val="16"/>
+              </w:rPr>
+              <w:t>0.9910</w:t>
+            </w:r>
+          </w:p>
+        </w:tc>
+        <w:tc>
+          <w:tcPr>
+            <w:tcW w:type="dxa" w:w="2835"/>
+          </w:tcPr>
+          <w:p>
+            <w:r>
+              <w:rPr>
+                <w:sz w:val="16"/>
+              </w:rPr>
+              <w:t>curated CVD treatments</w:t>
+            </w:r>
+          </w:p>
+        </w:tc>
+        <w:tc>
+          <w:tcPr>
+            <w:tcW w:type="dxa" w:w="1417"/>
+          </w:tcPr>
+          <w:p>
+            <w:r>
+              <w:rPr>
+                <w:sz w:val="16"/>
+              </w:rPr>
+              <w:t>PLAUSIBLE</w:t>
+            </w:r>
+          </w:p>
+        </w:tc>
+      </w:tr>
+      <w:tr>
+        <w:tc>
+          <w:tcPr>
+            <w:tcW w:type="dxa" w:w="2268"/>
+          </w:tcPr>
+          <w:p>
+            <w:r>
+              <w:rPr>
+                <w:sz w:val="16"/>
+              </w:rPr>
+              <w:t>Candesartan cilexetil</w:t>
+            </w:r>
+          </w:p>
+        </w:tc>
+        <w:tc>
+          <w:tcPr>
+            <w:tcW w:type="dxa" w:w="1020"/>
+          </w:tcPr>
+          <w:p>
+            <w:r>
+              <w:rPr>
+                <w:sz w:val="16"/>
+              </w:rPr>
+              <w:t>0.9910</w:t>
+            </w:r>
+          </w:p>
+        </w:tc>
+        <w:tc>
+          <w:tcPr>
+            <w:tcW w:type="dxa" w:w="2835"/>
+          </w:tcPr>
+          <w:p>
+            <w:r>
+              <w:rPr>
+                <w:sz w:val="16"/>
+              </w:rPr>
+              <w:t>curated CVD treatments</w:t>
+            </w:r>
+          </w:p>
+        </w:tc>
+        <w:tc>
+          <w:tcPr>
+            <w:tcW w:type="dxa" w:w="1417"/>
+          </w:tcPr>
+          <w:p>
+            <w:r>
+              <w:rPr>
+                <w:sz w:val="16"/>
+              </w:rPr>
+              <w:t>PLAUSIBLE</w:t>
+            </w:r>
+          </w:p>
+        </w:tc>
+      </w:tr>
+      <w:tr>
+        <w:tc>
+          <w:tcPr>
+            <w:tcW w:type="dxa" w:w="2268"/>
+          </w:tcPr>
+          <w:p>
+            <w:r>
+              <w:rPr>
+                <w:sz w:val="16"/>
+              </w:rPr>
+              <w:t>paricalcitol</w:t>
+            </w:r>
+          </w:p>
+        </w:tc>
+        <w:tc>
+          <w:tcPr>
+            <w:tcW w:type="dxa" w:w="1020"/>
+          </w:tcPr>
+          <w:p>
+            <w:r>
+              <w:rPr>
+                <w:sz w:val="16"/>
+              </w:rPr>
+              <w:t>0.9910</w:t>
+            </w:r>
+          </w:p>
+        </w:tc>
+        <w:tc>
+          <w:tcPr>
+            <w:tcW w:type="dxa" w:w="2835"/>
+          </w:tcPr>
+          <w:p>
+            <w:r>
+              <w:rPr>
+                <w:sz w:val="16"/>
+              </w:rPr>
+              <w:t>curated CVD treatments</w:t>
+            </w:r>
+          </w:p>
+        </w:tc>
+        <w:tc>
+          <w:tcPr>
+            <w:tcW w:type="dxa" w:w="1417"/>
+          </w:tcPr>
+          <w:p>
+            <w:r>
+              <w:rPr>
+                <w:sz w:val="16"/>
+              </w:rPr>
+              <w:t>PLAUSIBLE</w:t>
+            </w:r>
+          </w:p>
+        </w:tc>
+      </w:tr>
+      <w:tr>
+        <w:tc>
+          <w:tcPr>
+            <w:tcW w:type="dxa" w:w="2268"/>
+          </w:tcPr>
+          <w:p>
+            <w:r>
+              <w:rPr>
+                <w:sz w:val="16"/>
+              </w:rPr>
+              <w:t>acenocoumarol</w:t>
+            </w:r>
+          </w:p>
+        </w:tc>
+        <w:tc>
+          <w:tcPr>
+            <w:tcW w:type="dxa" w:w="1020"/>
+          </w:tcPr>
+          <w:p>
+            <w:r>
+              <w:rPr>
+                <w:sz w:val="16"/>
+              </w:rPr>
+              <w:t>0.9910</w:t>
+            </w:r>
+          </w:p>
+        </w:tc>
+        <w:tc>
+          <w:tcPr>
+            <w:tcW w:type="dxa" w:w="2835"/>
+          </w:tcPr>
+          <w:p>
+            <w:r>
+              <w:rPr>
+                <w:sz w:val="16"/>
+              </w:rPr>
+              <w:t>CVD pharmacologic class</w:t>
+            </w:r>
+          </w:p>
+        </w:tc>
+        <w:tc>
+          <w:tcPr>
+            <w:tcW w:type="dxa" w:w="1417"/>
+          </w:tcPr>
+          <w:p>
+            <w:r>
+              <w:rPr>
+                <w:sz w:val="16"/>
+              </w:rPr>
+              <w:t>PLAUSIBLE</w:t>
+            </w:r>
+          </w:p>
+        </w:tc>
+      </w:tr>
+      <w:tr>
+        <w:tc>
+          <w:tcPr>
+            <w:tcW w:type="dxa" w:w="2268"/>
+          </w:tcPr>
+          <w:p>
+            <w:r>
+              <w:rPr>
+                <w:sz w:val="16"/>
+              </w:rPr>
+              <w:t>Nylidrin</w:t>
+            </w:r>
+          </w:p>
+        </w:tc>
+        <w:tc>
+          <w:tcPr>
+            <w:tcW w:type="dxa" w:w="1020"/>
+          </w:tcPr>
+          <w:p>
+            <w:r>
+              <w:rPr>
+                <w:sz w:val="16"/>
+              </w:rPr>
+              <w:t>0.9910</w:t>
+            </w:r>
+          </w:p>
+        </w:tc>
+        <w:tc>
+          <w:tcPr>
+            <w:tcW w:type="dxa" w:w="2835"/>
+          </w:tcPr>
+          <w:p>
+            <w:r>
+              <w:rPr>
+                <w:sz w:val="16"/>
+              </w:rPr>
+              <w:t>curated CVD treatments</w:t>
+            </w:r>
+          </w:p>
+        </w:tc>
+        <w:tc>
+          <w:tcPr>
+            <w:tcW w:type="dxa" w:w="1417"/>
+          </w:tcPr>
+          <w:p>
+            <w:r>
+              <w:rPr>
+                <w:sz w:val="16"/>
+              </w:rPr>
+              <w:t>PLAUSIBLE</w:t>
+            </w:r>
+          </w:p>
+        </w:tc>
+      </w:tr>
+      <w:tr>
+        <w:tc>
+          <w:tcPr>
+            <w:tcW w:type="dxa" w:w="2268"/>
+          </w:tcPr>
+          <w:p>
+            <w:r>
+              <w:rPr>
+                <w:sz w:val="16"/>
+              </w:rPr>
+              <w:t>Dalteparin</w:t>
+            </w:r>
+          </w:p>
+        </w:tc>
+        <w:tc>
+          <w:tcPr>
+            <w:tcW w:type="dxa" w:w="1020"/>
+          </w:tcPr>
+          <w:p>
+            <w:r>
+              <w:rPr>
+                <w:sz w:val="16"/>
+              </w:rPr>
+              <w:t>0.9910</w:t>
+            </w:r>
+          </w:p>
+        </w:tc>
+        <w:tc>
+          <w:tcPr>
+            <w:tcW w:type="dxa" w:w="2835"/>
+          </w:tcPr>
+          <w:p>
+            <w:r>
+              <w:rPr>
+                <w:sz w:val="16"/>
+              </w:rPr>
+              <w:t>curated CVD treatments</w:t>
+            </w:r>
+          </w:p>
+        </w:tc>
+        <w:tc>
+          <w:tcPr>
+            <w:tcW w:type="dxa" w:w="1417"/>
+          </w:tcPr>
+          <w:p>
+            <w:r>
+              <w:rPr>
+                <w:sz w:val="16"/>
+              </w:rPr>
+              <w:t>PLAUSIBLE</w:t>
+            </w:r>
+          </w:p>
+        </w:tc>
+      </w:tr>
+      <w:tr>
+        <w:tc>
+          <w:tcPr>
+            <w:tcW w:type="dxa" w:w="2268"/>
+          </w:tcPr>
+          <w:p>
+            <w:r>
+              <w:rPr>
+                <w:sz w:val="16"/>
+              </w:rPr>
+              <w:t>Captopril</w:t>
+            </w:r>
+          </w:p>
+        </w:tc>
+        <w:tc>
+          <w:tcPr>
+            <w:tcW w:type="dxa" w:w="1020"/>
+          </w:tcPr>
+          <w:p>
+            <w:r>
+              <w:rPr>
+                <w:sz w:val="16"/>
+              </w:rPr>
+              <w:t>0.9910</w:t>
+            </w:r>
+          </w:p>
+        </w:tc>
+        <w:tc>
+          <w:tcPr>
+            <w:tcW w:type="dxa" w:w="2835"/>
+          </w:tcPr>
+          <w:p>
+            <w:r>
+              <w:rPr>
+                <w:sz w:val="16"/>
+              </w:rPr>
+              <w:t>curated CVD treatments</w:t>
+            </w:r>
+          </w:p>
+        </w:tc>
+        <w:tc>
+          <w:tcPr>
+            <w:tcW w:type="dxa" w:w="1417"/>
+          </w:tcPr>
+          <w:p>
+            <w:r>
+              <w:rPr>
+                <w:sz w:val="16"/>
+              </w:rPr>
+              <w:t>PLAUSIBLE</w:t>
+            </w:r>
+          </w:p>
+        </w:tc>
+      </w:tr>
+      <w:tr>
+        <w:tc>
+          <w:tcPr>
+            <w:tcW w:type="dxa" w:w="2268"/>
+          </w:tcPr>
+          <w:p>
+            <w:r>
+              <w:rPr>
+                <w:sz w:val="16"/>
+              </w:rPr>
+              <w:t>Diltiazem</w:t>
+            </w:r>
+          </w:p>
+        </w:tc>
+        <w:tc>
+          <w:tcPr>
+            <w:tcW w:type="dxa" w:w="1020"/>
+          </w:tcPr>
+          <w:p>
+            <w:r>
+              <w:rPr>
+                <w:sz w:val="16"/>
+              </w:rPr>
+              <w:t>0.9910</w:t>
+            </w:r>
+          </w:p>
+        </w:tc>
+        <w:tc>
+          <w:tcPr>
+            <w:tcW w:type="dxa" w:w="2835"/>
+          </w:tcPr>
+          <w:p>
+            <w:r>
+              <w:rPr>
+                <w:sz w:val="16"/>
+              </w:rPr>
+              <w:t>curated CVD treatments</w:t>
+            </w:r>
+          </w:p>
+        </w:tc>
+        <w:tc>
+          <w:tcPr>
+            <w:tcW w:type="dxa" w:w="1417"/>
+          </w:tcPr>
+          <w:p>
+            <w:r>
+              <w:rPr>
+                <w:sz w:val="16"/>
+              </w:rPr>
+              <w:t>PLAUSIBLE</w:t>
+            </w:r>
+          </w:p>
+        </w:tc>
+      </w:tr>
+      <w:tr>
+        <w:tc>
+          <w:tcPr>
+            <w:tcW w:type="dxa" w:w="2268"/>
+          </w:tcPr>
+          <w:p>
+            <w:r>
+              <w:rPr>
+                <w:sz w:val="16"/>
+              </w:rPr>
+              <w:t>serdexmethylphenidate</w:t>
+            </w:r>
+          </w:p>
+        </w:tc>
+        <w:tc>
+          <w:tcPr>
+            <w:tcW w:type="dxa" w:w="1020"/>
+          </w:tcPr>
+          <w:p>
+            <w:r>
+              <w:rPr>
+                <w:sz w:val="16"/>
+              </w:rPr>
+              <w:t>0.9910</w:t>
+            </w:r>
+          </w:p>
+        </w:tc>
+        <w:tc>
+          <w:tcPr>
+            <w:tcW w:type="dxa" w:w="2835"/>
+          </w:tcPr>
+          <w:p>
+            <w:r>
+              <w:rPr>
+                <w:sz w:val="16"/>
+              </w:rPr>
+              <w:t>CNS/psychiatry drug</w:t>
+            </w:r>
+          </w:p>
+        </w:tc>
+        <w:tc>
+          <w:tcPr>
+            <w:tcW w:type="dxa" w:w="1417"/>
+          </w:tcPr>
+          <w:p>
+            <w:r>
+              <w:rPr>
+                <w:sz w:val="16"/>
+              </w:rPr>
+              <w:t>IMPLAUSIBLE</w:t>
+            </w:r>
+          </w:p>
+        </w:tc>
+      </w:tr>
+      <w:tr>
+        <w:tc>
+          <w:tcPr>
+            <w:tcW w:type="dxa" w:w="2268"/>
+          </w:tcPr>
+          <w:p>
+            <w:r>
+              <w:rPr>
+                <w:sz w:val="16"/>
+              </w:rPr>
+              <w:t>Dehydroascorbic acid</w:t>
+            </w:r>
+          </w:p>
+        </w:tc>
+        <w:tc>
+          <w:tcPr>
+            <w:tcW w:type="dxa" w:w="1020"/>
+          </w:tcPr>
+          <w:p>
+            <w:r>
+              <w:rPr>
+                <w:sz w:val="16"/>
+              </w:rPr>
+              <w:t>0.9910</w:t>
+            </w:r>
+          </w:p>
+        </w:tc>
+        <w:tc>
+          <w:tcPr>
+            <w:tcW w:type="dxa" w:w="2835"/>
+          </w:tcPr>
+          <w:p>
+            <w:r>
+              <w:rPr>
+                <w:sz w:val="16"/>
+              </w:rPr>
+              <w:t>curated CVD treatments</w:t>
+            </w:r>
+          </w:p>
+        </w:tc>
+        <w:tc>
+          <w:tcPr>
+            <w:tcW w:type="dxa" w:w="1417"/>
+          </w:tcPr>
+          <w:p>
+            <w:r>
+              <w:rPr>
+                <w:sz w:val="16"/>
+              </w:rPr>
+              <w:t>PLAUSIBLE</w:t>
+            </w:r>
+          </w:p>
+        </w:tc>
+      </w:tr>
+      <w:tr>
+        <w:tc>
+          <w:tcPr>
+            <w:tcW w:type="dxa" w:w="2268"/>
+          </w:tcPr>
+          <w:p>
+            <w:r>
+              <w:rPr>
+                <w:sz w:val="16"/>
+              </w:rPr>
+              <w:t>Clopidogrel</w:t>
+            </w:r>
+          </w:p>
+        </w:tc>
+        <w:tc>
+          <w:tcPr>
+            <w:tcW w:type="dxa" w:w="1020"/>
+          </w:tcPr>
+          <w:p>
+            <w:r>
+              <w:rPr>
+                <w:sz w:val="16"/>
+              </w:rPr>
+              <w:t>0.9910</w:t>
+            </w:r>
+          </w:p>
+        </w:tc>
+        <w:tc>
+          <w:tcPr>
+            <w:tcW w:type="dxa" w:w="2835"/>
+          </w:tcPr>
+          <w:p>
+            <w:r>
+              <w:rPr>
+                <w:sz w:val="16"/>
+              </w:rPr>
+              <w:t>curated CVD treatments</w:t>
+            </w:r>
+          </w:p>
+        </w:tc>
+        <w:tc>
+          <w:tcPr>
+            <w:tcW w:type="dxa" w:w="1417"/>
+          </w:tcPr>
+          <w:p>
+            <w:r>
+              <w:rPr>
+                <w:sz w:val="16"/>
+              </w:rPr>
+              <w:t>PLAUSIBLE</w:t>
+            </w:r>
+          </w:p>
+        </w:tc>
+      </w:tr>
+      <w:tr>
+        <w:tc>
+          <w:tcPr>
+            <w:tcW w:type="dxa" w:w="2268"/>
+          </w:tcPr>
+          <w:p>
+            <w:r>
+              <w:rPr>
+                <w:sz w:val="16"/>
+              </w:rPr>
+              <w:t>Olmesartan</w:t>
+            </w:r>
+          </w:p>
+        </w:tc>
+        <w:tc>
+          <w:tcPr>
+            <w:tcW w:type="dxa" w:w="1020"/>
+          </w:tcPr>
+          <w:p>
+            <w:r>
+              <w:rPr>
+                <w:sz w:val="16"/>
+              </w:rPr>
+              <w:t>0.9910</w:t>
+            </w:r>
+          </w:p>
+        </w:tc>
+        <w:tc>
+          <w:tcPr>
+            <w:tcW w:type="dxa" w:w="2835"/>
+          </w:tcPr>
+          <w:p>
+            <w:r>
+              <w:rPr>
+                <w:sz w:val="16"/>
+              </w:rPr>
+              <w:t>curated CVD treatments</w:t>
+            </w:r>
+          </w:p>
+        </w:tc>
+        <w:tc>
+          <w:tcPr>
+            <w:tcW w:type="dxa" w:w="1417"/>
+          </w:tcPr>
+          <w:p>
+            <w:r>
+              <w:rPr>
+                <w:sz w:val="16"/>
+              </w:rPr>
+              <w:t>PLAUSIBLE</w:t>
+            </w:r>
+          </w:p>
+        </w:tc>
+      </w:tr>
+      <w:tr>
+        <w:tc>
+          <w:tcPr>
+            <w:tcW w:type="dxa" w:w="2268"/>
+          </w:tcPr>
+          <w:p>
+            <w:r>
+              <w:rPr>
+                <w:sz w:val="16"/>
+              </w:rPr>
+              <w:t>Streptokinase</w:t>
+            </w:r>
+          </w:p>
+        </w:tc>
+        <w:tc>
+          <w:tcPr>
+            <w:tcW w:type="dxa" w:w="1020"/>
+          </w:tcPr>
+          <w:p>
+            <w:r>
+              <w:rPr>
+                <w:sz w:val="16"/>
+              </w:rPr>
+              <w:t>0.9910</w:t>
+            </w:r>
+          </w:p>
+        </w:tc>
+        <w:tc>
+          <w:tcPr>
+            <w:tcW w:type="dxa" w:w="2835"/>
+          </w:tcPr>
+          <w:p>
+            <w:r>
+              <w:rPr>
+                <w:sz w:val="16"/>
+              </w:rPr>
+              <w:t>curated CVD treatments</w:t>
+            </w:r>
+          </w:p>
+        </w:tc>
+        <w:tc>
+          <w:tcPr>
+            <w:tcW w:type="dxa" w:w="1417"/>
+          </w:tcPr>
+          <w:p>
+            <w:r>
+              <w:rPr>
+                <w:sz w:val="16"/>
+              </w:rPr>
+              <w:t>PLAUSIBLE</w:t>
+            </w:r>
+          </w:p>
+        </w:tc>
+      </w:tr>
+      <w:tr>
+        <w:tc>
+          <w:tcPr>
+            <w:tcW w:type="dxa" w:w="2268"/>
+          </w:tcPr>
+          <w:p>
+            <w:r>
+              <w:rPr>
+                <w:sz w:val="16"/>
+              </w:rPr>
+              <w:t>Propranolol</w:t>
+            </w:r>
+          </w:p>
+        </w:tc>
+        <w:tc>
+          <w:tcPr>
+            <w:tcW w:type="dxa" w:w="1020"/>
+          </w:tcPr>
+          <w:p>
+            <w:r>
+              <w:rPr>
+                <w:sz w:val="16"/>
+              </w:rPr>
+              <w:t>0.9910</w:t>
+            </w:r>
+          </w:p>
+        </w:tc>
+        <w:tc>
+          <w:tcPr>
+            <w:tcW w:type="dxa" w:w="2835"/>
+          </w:tcPr>
+          <w:p>
+            <w:r>
+              <w:rPr>
+                <w:sz w:val="16"/>
+              </w:rPr>
+              <w:t>curated CVD treatments</w:t>
+            </w:r>
+          </w:p>
+        </w:tc>
+        <w:tc>
+          <w:tcPr>
+            <w:tcW w:type="dxa" w:w="1417"/>
+          </w:tcPr>
+          <w:p>
+            <w:r>
+              <w:rPr>
+                <w:sz w:val="16"/>
+              </w:rPr>
+              <w:t>PLAUSIBLE</w:t>
+            </w:r>
+          </w:p>
+        </w:tc>
+      </w:tr>
+    </w:tbl>
+    <w:p/>
+    <w:p>
+      <w:r>
+        <w:rPr>
+          <w:b/>
+          <w:sz w:val="22"/>
+        </w:rPr>
+        <w:t>Top 20 Predictions — Hypertension</w:t>
+      </w:r>
+    </w:p>
+    <w:tbl>
+      <w:tblPr>
+        <w:tblStyle w:val="LightGrid-Accent1"/>
+        <w:tblW w:type="auto" w:w="0"/>
+        <w:jc w:val="center"/>
+        <w:tblLook w:firstColumn="1" w:firstRow="1" w:lastColumn="0" w:lastRow="0" w:noHBand="0" w:noVBand="1" w:val="04A0"/>
+      </w:tblPr>
+      <w:tblGrid>
+        <w:gridCol w:w="2160"/>
+        <w:gridCol w:w="2160"/>
+        <w:gridCol w:w="2160"/>
+        <w:gridCol w:w="2160"/>
+      </w:tblGrid>
+      <w:tr>
+        <w:tc>
+          <w:tcPr>
+            <w:tcW w:type="dxa" w:w="2268"/>
+          </w:tcPr>
+          <w:p>
+            <w:r>
+              <w:rPr>
+                <w:b/>
+                <w:sz w:val="16"/>
+              </w:rPr>
+              <w:t>Drug</w:t>
+            </w:r>
+          </w:p>
+        </w:tc>
+        <w:tc>
+          <w:tcPr>
+            <w:tcW w:type="dxa" w:w="1020"/>
+          </w:tcPr>
+          <w:p>
+            <w:r>
+              <w:rPr>
+                <w:b/>
+                <w:sz w:val="16"/>
+              </w:rPr>
+              <w:t>Confidence</w:t>
+            </w:r>
+          </w:p>
+        </w:tc>
+        <w:tc>
+          <w:tcPr>
+            <w:tcW w:type="dxa" w:w="2835"/>
+          </w:tcPr>
+          <w:p>
+            <w:r>
+              <w:rPr>
+                <w:b/>
+                <w:sz w:val="16"/>
+              </w:rPr>
+              <w:t>Basis</w:t>
+            </w:r>
+          </w:p>
+        </w:tc>
+        <w:tc>
+          <w:tcPr>
+            <w:tcW w:type="dxa" w:w="1417"/>
+          </w:tcPr>
+          <w:p>
+            <w:r>
+              <w:rPr>
+                <w:b/>
+                <w:sz w:val="16"/>
+              </w:rPr>
+              <w:t>Verdict</w:t>
+            </w:r>
+          </w:p>
+        </w:tc>
+      </w:tr>
+      <w:tr>
+        <w:tc>
+          <w:tcPr>
+            <w:tcW w:type="dxa" w:w="2268"/>
+          </w:tcPr>
+          <w:p>
+            <w:r>
+              <w:rPr>
+                <w:sz w:val="16"/>
+              </w:rPr>
+              <w:t>Warfarin</w:t>
+            </w:r>
+          </w:p>
+        </w:tc>
+        <w:tc>
+          <w:tcPr>
+            <w:tcW w:type="dxa" w:w="1020"/>
+          </w:tcPr>
+          <w:p>
+            <w:r>
+              <w:rPr>
+                <w:sz w:val="16"/>
+              </w:rPr>
+              <w:t>0.9910</w:t>
+            </w:r>
+          </w:p>
+        </w:tc>
+        <w:tc>
+          <w:tcPr>
+            <w:tcW w:type="dxa" w:w="2835"/>
+          </w:tcPr>
+          <w:p>
+            <w:r>
+              <w:rPr>
+                <w:sz w:val="16"/>
+              </w:rPr>
+              <w:t>curated CVD treatments</w:t>
+            </w:r>
+          </w:p>
+        </w:tc>
+        <w:tc>
+          <w:tcPr>
+            <w:tcW w:type="dxa" w:w="1417"/>
+          </w:tcPr>
+          <w:p>
+            <w:r>
+              <w:rPr>
+                <w:sz w:val="16"/>
+              </w:rPr>
+              <w:t>PLAUSIBLE</w:t>
+            </w:r>
+          </w:p>
+        </w:tc>
+      </w:tr>
+      <w:tr>
+        <w:tc>
+          <w:tcPr>
+            <w:tcW w:type="dxa" w:w="2268"/>
+          </w:tcPr>
+          <w:p>
+            <w:r>
+              <w:rPr>
+                <w:sz w:val="16"/>
+              </w:rPr>
+              <w:t>acenocoumarol</w:t>
+            </w:r>
+          </w:p>
+        </w:tc>
+        <w:tc>
+          <w:tcPr>
+            <w:tcW w:type="dxa" w:w="1020"/>
+          </w:tcPr>
+          <w:p>
+            <w:r>
+              <w:rPr>
+                <w:sz w:val="16"/>
+              </w:rPr>
+              <w:t>0.9910</w:t>
+            </w:r>
+          </w:p>
+        </w:tc>
+        <w:tc>
+          <w:tcPr>
+            <w:tcW w:type="dxa" w:w="2835"/>
+          </w:tcPr>
+          <w:p>
+            <w:r>
+              <w:rPr>
+                <w:sz w:val="16"/>
+              </w:rPr>
+              <w:t>CVD pharmacologic class</w:t>
+            </w:r>
+          </w:p>
+        </w:tc>
+        <w:tc>
+          <w:tcPr>
+            <w:tcW w:type="dxa" w:w="1417"/>
+          </w:tcPr>
+          <w:p>
+            <w:r>
+              <w:rPr>
+                <w:sz w:val="16"/>
+              </w:rPr>
+              <w:t>PLAUSIBLE</w:t>
+            </w:r>
+          </w:p>
+        </w:tc>
+      </w:tr>
+      <w:tr>
+        <w:tc>
+          <w:tcPr>
+            <w:tcW w:type="dxa" w:w="2268"/>
+          </w:tcPr>
+          <w:p>
+            <w:r>
+              <w:rPr>
+                <w:sz w:val="16"/>
+              </w:rPr>
+              <w:t>Cytarabine</w:t>
+            </w:r>
+          </w:p>
+        </w:tc>
+        <w:tc>
+          <w:tcPr>
+            <w:tcW w:type="dxa" w:w="1020"/>
+          </w:tcPr>
+          <w:p>
+            <w:r>
+              <w:rPr>
+                <w:sz w:val="16"/>
+              </w:rPr>
+              <w:t>0.9910</w:t>
+            </w:r>
+          </w:p>
+        </w:tc>
+        <w:tc>
+          <w:tcPr>
+            <w:tcW w:type="dxa" w:w="2835"/>
+          </w:tcPr>
+          <w:p>
+            <w:r>
+              <w:rPr>
+                <w:sz w:val="16"/>
+              </w:rPr>
+              <w:t>oncology drug</w:t>
+            </w:r>
+          </w:p>
+        </w:tc>
+        <w:tc>
+          <w:tcPr>
+            <w:tcW w:type="dxa" w:w="1417"/>
+          </w:tcPr>
+          <w:p>
+            <w:r>
+              <w:rPr>
+                <w:sz w:val="16"/>
+              </w:rPr>
+              <w:t>IMPLAUSIBLE</w:t>
+            </w:r>
+          </w:p>
+        </w:tc>
+      </w:tr>
+      <w:tr>
+        <w:tc>
+          <w:tcPr>
+            <w:tcW w:type="dxa" w:w="2268"/>
+          </w:tcPr>
+          <w:p>
+            <w:r>
+              <w:rPr>
+                <w:sz w:val="16"/>
+              </w:rPr>
+              <w:t>Gilteritinib</w:t>
+            </w:r>
+          </w:p>
+        </w:tc>
+        <w:tc>
+          <w:tcPr>
+            <w:tcW w:type="dxa" w:w="1020"/>
+          </w:tcPr>
+          <w:p>
+            <w:r>
+              <w:rPr>
+                <w:sz w:val="16"/>
+              </w:rPr>
+              <w:t>0.9910</w:t>
+            </w:r>
+          </w:p>
+        </w:tc>
+        <w:tc>
+          <w:tcPr>
+            <w:tcW w:type="dxa" w:w="2835"/>
+          </w:tcPr>
+          <w:p>
+            <w:r>
+              <w:rPr>
+                <w:sz w:val="16"/>
+              </w:rPr>
+              <w:t>oncology drug</w:t>
+            </w:r>
+          </w:p>
+        </w:tc>
+        <w:tc>
+          <w:tcPr>
+            <w:tcW w:type="dxa" w:w="1417"/>
+          </w:tcPr>
+          <w:p>
+            <w:r>
+              <w:rPr>
+                <w:sz w:val="16"/>
+              </w:rPr>
+              <w:t>IMPLAUSIBLE</w:t>
+            </w:r>
+          </w:p>
+        </w:tc>
+      </w:tr>
+      <w:tr>
+        <w:tc>
+          <w:tcPr>
+            <w:tcW w:type="dxa" w:w="2268"/>
+          </w:tcPr>
+          <w:p>
+            <w:r>
+              <w:rPr>
+                <w:sz w:val="16"/>
+              </w:rPr>
+              <w:t>pitavastatin</w:t>
+            </w:r>
+          </w:p>
+        </w:tc>
+        <w:tc>
+          <w:tcPr>
+            <w:tcW w:type="dxa" w:w="1020"/>
+          </w:tcPr>
+          <w:p>
+            <w:r>
+              <w:rPr>
+                <w:sz w:val="16"/>
+              </w:rPr>
+              <w:t>0.9910</w:t>
+            </w:r>
+          </w:p>
+        </w:tc>
+        <w:tc>
+          <w:tcPr>
+            <w:tcW w:type="dxa" w:w="2835"/>
+          </w:tcPr>
+          <w:p>
+            <w:r>
+              <w:rPr>
+                <w:sz w:val="16"/>
+              </w:rPr>
+              <w:t>CVD pharmacologic class (statin)</w:t>
+            </w:r>
+          </w:p>
+        </w:tc>
+        <w:tc>
+          <w:tcPr>
+            <w:tcW w:type="dxa" w:w="1417"/>
+          </w:tcPr>
+          <w:p>
+            <w:r>
+              <w:rPr>
+                <w:sz w:val="16"/>
+              </w:rPr>
+              <w:t>PLAUSIBLE</w:t>
+            </w:r>
+          </w:p>
+        </w:tc>
+      </w:tr>
+      <w:tr>
+        <w:tc>
+          <w:tcPr>
+            <w:tcW w:type="dxa" w:w="2268"/>
+          </w:tcPr>
+          <w:p>
+            <w:r>
+              <w:rPr>
+                <w:sz w:val="16"/>
+              </w:rPr>
+              <w:t>serdexmethylphenidate</w:t>
+            </w:r>
+          </w:p>
+        </w:tc>
+        <w:tc>
+          <w:tcPr>
+            <w:tcW w:type="dxa" w:w="1020"/>
+          </w:tcPr>
+          <w:p>
+            <w:r>
+              <w:rPr>
+                <w:sz w:val="16"/>
+              </w:rPr>
+              <w:t>0.9910</w:t>
+            </w:r>
+          </w:p>
+        </w:tc>
+        <w:tc>
+          <w:tcPr>
+            <w:tcW w:type="dxa" w:w="2835"/>
+          </w:tcPr>
+          <w:p>
+            <w:r>
+              <w:rPr>
+                <w:sz w:val="16"/>
+              </w:rPr>
+              <w:t>CNS/psychiatry drug</w:t>
+            </w:r>
+          </w:p>
+        </w:tc>
+        <w:tc>
+          <w:tcPr>
+            <w:tcW w:type="dxa" w:w="1417"/>
+          </w:tcPr>
+          <w:p>
+            <w:r>
+              <w:rPr>
+                <w:sz w:val="16"/>
+              </w:rPr>
+              <w:t>IMPLAUSIBLE</w:t>
+            </w:r>
+          </w:p>
+        </w:tc>
+      </w:tr>
+      <w:tr>
+        <w:tc>
+          <w:tcPr>
+            <w:tcW w:type="dxa" w:w="2268"/>
+          </w:tcPr>
+          <w:p>
+            <w:r>
+              <w:rPr>
+                <w:sz w:val="16"/>
+              </w:rPr>
+              <w:t>Nylidrin</w:t>
+            </w:r>
+          </w:p>
+        </w:tc>
+        <w:tc>
+          <w:tcPr>
+            <w:tcW w:type="dxa" w:w="1020"/>
+          </w:tcPr>
+          <w:p>
+            <w:r>
+              <w:rPr>
+                <w:sz w:val="16"/>
+              </w:rPr>
+              <w:t>0.9910</w:t>
+            </w:r>
+          </w:p>
+        </w:tc>
+        <w:tc>
+          <w:tcPr>
+            <w:tcW w:type="dxa" w:w="2835"/>
+          </w:tcPr>
+          <w:p>
+            <w:r>
+              <w:rPr>
+                <w:sz w:val="16"/>
+              </w:rPr>
+              <w:t>curated CVD treatments</w:t>
+            </w:r>
+          </w:p>
+        </w:tc>
+        <w:tc>
+          <w:tcPr>
+            <w:tcW w:type="dxa" w:w="1417"/>
+          </w:tcPr>
+          <w:p>
+            <w:r>
+              <w:rPr>
+                <w:sz w:val="16"/>
+              </w:rPr>
+              <w:t>PLAUSIBLE</w:t>
+            </w:r>
+          </w:p>
+        </w:tc>
+      </w:tr>
+      <w:tr>
+        <w:tc>
+          <w:tcPr>
+            <w:tcW w:type="dxa" w:w="2268"/>
+          </w:tcPr>
+          <w:p>
+            <w:r>
+              <w:rPr>
+                <w:sz w:val="16"/>
+              </w:rPr>
+              <w:t>Rivaroxaban</w:t>
+            </w:r>
+          </w:p>
+        </w:tc>
+        <w:tc>
+          <w:tcPr>
+            <w:tcW w:type="dxa" w:w="1020"/>
+          </w:tcPr>
+          <w:p>
+            <w:r>
+              <w:rPr>
+                <w:sz w:val="16"/>
+              </w:rPr>
+              <w:t>0.9910</w:t>
+            </w:r>
+          </w:p>
+        </w:tc>
+        <w:tc>
+          <w:tcPr>
+            <w:tcW w:type="dxa" w:w="2835"/>
+          </w:tcPr>
+          <w:p>
+            <w:r>
+              <w:rPr>
+                <w:sz w:val="16"/>
+              </w:rPr>
+              <w:t>curated CVD treatments</w:t>
+            </w:r>
+          </w:p>
+        </w:tc>
+        <w:tc>
+          <w:tcPr>
+            <w:tcW w:type="dxa" w:w="1417"/>
+          </w:tcPr>
+          <w:p>
+            <w:r>
+              <w:rPr>
+                <w:sz w:val="16"/>
+              </w:rPr>
+              <w:t>PLAUSIBLE</w:t>
+            </w:r>
+          </w:p>
+        </w:tc>
+      </w:tr>
+      <w:tr>
+        <w:tc>
+          <w:tcPr>
+            <w:tcW w:type="dxa" w:w="2268"/>
+          </w:tcPr>
+          <w:p>
+            <w:r>
+              <w:rPr>
+                <w:sz w:val="16"/>
+              </w:rPr>
+              <w:t>Dalteparin</w:t>
+            </w:r>
+          </w:p>
+        </w:tc>
+        <w:tc>
+          <w:tcPr>
+            <w:tcW w:type="dxa" w:w="1020"/>
+          </w:tcPr>
+          <w:p>
+            <w:r>
+              <w:rPr>
+                <w:sz w:val="16"/>
+              </w:rPr>
+              <w:t>0.9910</w:t>
+            </w:r>
+          </w:p>
+        </w:tc>
+        <w:tc>
+          <w:tcPr>
+            <w:tcW w:type="dxa" w:w="2835"/>
+          </w:tcPr>
+          <w:p>
+            <w:r>
+              <w:rPr>
+                <w:sz w:val="16"/>
+              </w:rPr>
+              <w:t>curated CVD treatments</w:t>
+            </w:r>
+          </w:p>
+        </w:tc>
+        <w:tc>
+          <w:tcPr>
+            <w:tcW w:type="dxa" w:w="1417"/>
+          </w:tcPr>
+          <w:p>
+            <w:r>
+              <w:rPr>
+                <w:sz w:val="16"/>
+              </w:rPr>
+              <w:t>PLAUSIBLE</w:t>
+            </w:r>
+          </w:p>
+        </w:tc>
+      </w:tr>
+      <w:tr>
+        <w:tc>
+          <w:tcPr>
+            <w:tcW w:type="dxa" w:w="2268"/>
+          </w:tcPr>
+          <w:p>
+            <w:r>
+              <w:rPr>
+                <w:sz w:val="16"/>
+              </w:rPr>
+              <w:t>alteplase</w:t>
+            </w:r>
+          </w:p>
+        </w:tc>
+        <w:tc>
+          <w:tcPr>
+            <w:tcW w:type="dxa" w:w="1020"/>
+          </w:tcPr>
+          <w:p>
+            <w:r>
+              <w:rPr>
+                <w:sz w:val="16"/>
+              </w:rPr>
+              <w:t>0.9910</w:t>
+            </w:r>
+          </w:p>
+        </w:tc>
+        <w:tc>
+          <w:tcPr>
+            <w:tcW w:type="dxa" w:w="2835"/>
+          </w:tcPr>
+          <w:p>
+            <w:r>
+              <w:rPr>
+                <w:sz w:val="16"/>
+              </w:rPr>
+              <w:t>CVD pharmacologic class</w:t>
+            </w:r>
+          </w:p>
+        </w:tc>
+        <w:tc>
+          <w:tcPr>
+            <w:tcW w:type="dxa" w:w="1417"/>
+          </w:tcPr>
+          <w:p>
+            <w:r>
+              <w:rPr>
+                <w:sz w:val="16"/>
+              </w:rPr>
+              <w:t>PLAUSIBLE</w:t>
+            </w:r>
+          </w:p>
+        </w:tc>
+      </w:tr>
+      <w:tr>
+        <w:tc>
+          <w:tcPr>
+            <w:tcW w:type="dxa" w:w="2268"/>
+          </w:tcPr>
+          <w:p>
+            <w:r>
+              <w:rPr>
+                <w:sz w:val="16"/>
+              </w:rPr>
+              <w:t>Simvastatin</w:t>
+            </w:r>
+          </w:p>
+        </w:tc>
+        <w:tc>
+          <w:tcPr>
+            <w:tcW w:type="dxa" w:w="1020"/>
+          </w:tcPr>
+          <w:p>
+            <w:r>
+              <w:rPr>
+                <w:sz w:val="16"/>
+              </w:rPr>
+              <w:t>0.9910</w:t>
+            </w:r>
+          </w:p>
+        </w:tc>
+        <w:tc>
+          <w:tcPr>
+            <w:tcW w:type="dxa" w:w="2835"/>
+          </w:tcPr>
+          <w:p>
+            <w:r>
+              <w:rPr>
+                <w:sz w:val="16"/>
+              </w:rPr>
+              <w:t>curated CVD treatments</w:t>
+            </w:r>
+          </w:p>
+        </w:tc>
+        <w:tc>
+          <w:tcPr>
+            <w:tcW w:type="dxa" w:w="1417"/>
+          </w:tcPr>
+          <w:p>
+            <w:r>
+              <w:rPr>
+                <w:sz w:val="16"/>
+              </w:rPr>
+              <w:t>PLAUSIBLE</w:t>
+            </w:r>
+          </w:p>
+        </w:tc>
+      </w:tr>
+      <w:tr>
+        <w:tc>
+          <w:tcPr>
+            <w:tcW w:type="dxa" w:w="2268"/>
+          </w:tcPr>
+          <w:p>
+            <w:r>
+              <w:rPr>
+                <w:sz w:val="16"/>
+              </w:rPr>
+              <w:t>ferric derisomaltose</w:t>
+            </w:r>
+          </w:p>
+        </w:tc>
+        <w:tc>
+          <w:tcPr>
+            <w:tcW w:type="dxa" w:w="1020"/>
+          </w:tcPr>
+          <w:p>
+            <w:r>
+              <w:rPr>
+                <w:sz w:val="16"/>
+              </w:rPr>
+              <w:t>0.9910</w:t>
+            </w:r>
+          </w:p>
+        </w:tc>
+        <w:tc>
+          <w:tcPr>
+            <w:tcW w:type="dxa" w:w="2835"/>
+          </w:tcPr>
+          <w:p>
+            <w:r>
+              <w:rPr>
+                <w:sz w:val="16"/>
+              </w:rPr>
+              <w:t>anemia drug — indirect CVD link</w:t>
+            </w:r>
+          </w:p>
+        </w:tc>
+        <w:tc>
+          <w:tcPr>
+            <w:tcW w:type="dxa" w:w="1417"/>
+          </w:tcPr>
+          <w:p>
+            <w:r>
+              <w:rPr>
+                <w:sz w:val="16"/>
+              </w:rPr>
+              <w:t>AMBIGUOUS</w:t>
+            </w:r>
+          </w:p>
+        </w:tc>
+      </w:tr>
+      <w:tr>
+        <w:tc>
+          <w:tcPr>
+            <w:tcW w:type="dxa" w:w="2268"/>
+          </w:tcPr>
+          <w:p>
+            <w:r>
+              <w:rPr>
+                <w:sz w:val="16"/>
+              </w:rPr>
+              <w:t>Atorvastatin</w:t>
+            </w:r>
+          </w:p>
+        </w:tc>
+        <w:tc>
+          <w:tcPr>
+            <w:tcW w:type="dxa" w:w="1020"/>
+          </w:tcPr>
+          <w:p>
+            <w:r>
+              <w:rPr>
+                <w:sz w:val="16"/>
+              </w:rPr>
+              <w:t>0.9910</w:t>
+            </w:r>
+          </w:p>
+        </w:tc>
+        <w:tc>
+          <w:tcPr>
+            <w:tcW w:type="dxa" w:w="2835"/>
+          </w:tcPr>
+          <w:p>
+            <w:r>
+              <w:rPr>
+                <w:sz w:val="16"/>
+              </w:rPr>
+              <w:t>curated CVD treatments</w:t>
+            </w:r>
+          </w:p>
+        </w:tc>
+        <w:tc>
+          <w:tcPr>
+            <w:tcW w:type="dxa" w:w="1417"/>
+          </w:tcPr>
+          <w:p>
+            <w:r>
+              <w:rPr>
+                <w:sz w:val="16"/>
+              </w:rPr>
+              <w:t>PLAUSIBLE</w:t>
+            </w:r>
+          </w:p>
+        </w:tc>
+      </w:tr>
+      <w:tr>
+        <w:tc>
+          <w:tcPr>
+            <w:tcW w:type="dxa" w:w="2268"/>
+          </w:tcPr>
+          <w:p>
+            <w:r>
+              <w:rPr>
+                <w:sz w:val="16"/>
+              </w:rPr>
+              <w:t>Aminophylline</w:t>
+            </w:r>
+          </w:p>
+        </w:tc>
+        <w:tc>
+          <w:tcPr>
+            <w:tcW w:type="dxa" w:w="1020"/>
+          </w:tcPr>
+          <w:p>
+            <w:r>
+              <w:rPr>
+                <w:sz w:val="16"/>
+              </w:rPr>
+              <w:t>0.9910</w:t>
+            </w:r>
+          </w:p>
+        </w:tc>
+        <w:tc>
+          <w:tcPr>
+            <w:tcW w:type="dxa" w:w="2835"/>
+          </w:tcPr>
+          <w:p>
+            <w:r>
+              <w:rPr>
+                <w:sz w:val="16"/>
+              </w:rPr>
+              <w:t>curated CVD treatments</w:t>
+            </w:r>
+          </w:p>
+        </w:tc>
+        <w:tc>
+          <w:tcPr>
+            <w:tcW w:type="dxa" w:w="1417"/>
+          </w:tcPr>
+          <w:p>
+            <w:r>
+              <w:rPr>
+                <w:sz w:val="16"/>
+              </w:rPr>
+              <w:t>PLAUSIBLE</w:t>
+            </w:r>
+          </w:p>
+        </w:tc>
+      </w:tr>
+      <w:tr>
+        <w:tc>
+          <w:tcPr>
+            <w:tcW w:type="dxa" w:w="2268"/>
+          </w:tcPr>
+          <w:p>
+            <w:r>
+              <w:rPr>
+                <w:sz w:val="16"/>
+              </w:rPr>
+              <w:t>vidarabine</w:t>
+            </w:r>
+          </w:p>
+        </w:tc>
+        <w:tc>
+          <w:tcPr>
+            <w:tcW w:type="dxa" w:w="1020"/>
+          </w:tcPr>
+          <w:p>
+            <w:r>
+              <w:rPr>
+                <w:sz w:val="16"/>
+              </w:rPr>
+              <w:t>0.9910</w:t>
+            </w:r>
+          </w:p>
+        </w:tc>
+        <w:tc>
+          <w:tcPr>
+            <w:tcW w:type="dxa" w:w="2835"/>
+          </w:tcPr>
+          <w:p>
+            <w:r>
+              <w:rPr>
+                <w:sz w:val="16"/>
+              </w:rPr>
+              <w:t>infectious disease drug</w:t>
+            </w:r>
+          </w:p>
+        </w:tc>
+        <w:tc>
+          <w:tcPr>
+            <w:tcW w:type="dxa" w:w="1417"/>
+          </w:tcPr>
+          <w:p>
+            <w:r>
+              <w:rPr>
+                <w:sz w:val="16"/>
+              </w:rPr>
+              <w:t>IMPLAUSIBLE</w:t>
+            </w:r>
+          </w:p>
+        </w:tc>
+      </w:tr>
+      <w:tr>
+        <w:tc>
+          <w:tcPr>
+            <w:tcW w:type="dxa" w:w="2268"/>
+          </w:tcPr>
+          <w:p>
+            <w:r>
+              <w:rPr>
+                <w:sz w:val="16"/>
+              </w:rPr>
+              <w:t>HMG-CoA Reductase Inhibitors</w:t>
+            </w:r>
+          </w:p>
+        </w:tc>
+        <w:tc>
+          <w:tcPr>
+            <w:tcW w:type="dxa" w:w="1020"/>
+          </w:tcPr>
+          <w:p>
+            <w:r>
+              <w:rPr>
+                <w:sz w:val="16"/>
+              </w:rPr>
+              <w:t>0.9910</w:t>
+            </w:r>
+          </w:p>
+        </w:tc>
+        <w:tc>
+          <w:tcPr>
+            <w:tcW w:type="dxa" w:w="2835"/>
+          </w:tcPr>
+          <w:p>
+            <w:r>
+              <w:rPr>
+                <w:sz w:val="16"/>
+              </w:rPr>
+              <w:t>curated CVD treatments</w:t>
+            </w:r>
+          </w:p>
+        </w:tc>
+        <w:tc>
+          <w:tcPr>
+            <w:tcW w:type="dxa" w:w="1417"/>
+          </w:tcPr>
+          <w:p>
+            <w:r>
+              <w:rPr>
+                <w:sz w:val="16"/>
+              </w:rPr>
+              <w:t>PLAUSIBLE</w:t>
+            </w:r>
+          </w:p>
+        </w:tc>
+      </w:tr>
+      <w:tr>
+        <w:tc>
+          <w:tcPr>
+            <w:tcW w:type="dxa" w:w="2268"/>
+          </w:tcPr>
+          <w:p>
+            <w:r>
+              <w:rPr>
+                <w:sz w:val="16"/>
+              </w:rPr>
+              <w:t>Phenprocoumon</w:t>
+            </w:r>
+          </w:p>
+        </w:tc>
+        <w:tc>
+          <w:tcPr>
+            <w:tcW w:type="dxa" w:w="1020"/>
+          </w:tcPr>
+          <w:p>
+            <w:r>
+              <w:rPr>
+                <w:sz w:val="16"/>
+              </w:rPr>
+              <w:t>0.9910</w:t>
+            </w:r>
+          </w:p>
+        </w:tc>
+        <w:tc>
+          <w:tcPr>
+            <w:tcW w:type="dxa" w:w="2835"/>
+          </w:tcPr>
+          <w:p>
+            <w:r>
+              <w:rPr>
+                <w:sz w:val="16"/>
+              </w:rPr>
+              <w:t>curated CVD treatments</w:t>
+            </w:r>
+          </w:p>
+        </w:tc>
+        <w:tc>
+          <w:tcPr>
+            <w:tcW w:type="dxa" w:w="1417"/>
+          </w:tcPr>
+          <w:p>
+            <w:r>
+              <w:rPr>
+                <w:sz w:val="16"/>
+              </w:rPr>
+              <w:t>PLAUSIBLE</w:t>
+            </w:r>
+          </w:p>
+        </w:tc>
+      </w:tr>
+      <w:tr>
+        <w:tc>
+          <w:tcPr>
+            <w:tcW w:type="dxa" w:w="2268"/>
+          </w:tcPr>
+          <w:p>
+            <w:r>
+              <w:rPr>
+                <w:sz w:val="16"/>
+              </w:rPr>
+              <w:t>Ceftobiprole</w:t>
+            </w:r>
+          </w:p>
+        </w:tc>
+        <w:tc>
+          <w:tcPr>
+            <w:tcW w:type="dxa" w:w="1020"/>
+          </w:tcPr>
+          <w:p>
+            <w:r>
+              <w:rPr>
+                <w:sz w:val="16"/>
+              </w:rPr>
+              <w:t>0.9910</w:t>
+            </w:r>
+          </w:p>
+        </w:tc>
+        <w:tc>
+          <w:tcPr>
+            <w:tcW w:type="dxa" w:w="2835"/>
+          </w:tcPr>
+          <w:p>
+            <w:r>
+              <w:rPr>
+                <w:sz w:val="16"/>
+              </w:rPr>
+              <w:t>curated CVD treatments</w:t>
+            </w:r>
+          </w:p>
+        </w:tc>
+        <w:tc>
+          <w:tcPr>
+            <w:tcW w:type="dxa" w:w="1417"/>
+          </w:tcPr>
+          <w:p>
+            <w:r>
+              <w:rPr>
+                <w:sz w:val="16"/>
+              </w:rPr>
+              <w:t>PLAUSIBLE</w:t>
+            </w:r>
+          </w:p>
+        </w:tc>
+      </w:tr>
+      <w:tr>
+        <w:tc>
+          <w:tcPr>
+            <w:tcW w:type="dxa" w:w="2268"/>
+          </w:tcPr>
+          <w:p>
+            <w:r>
+              <w:rPr>
+                <w:sz w:val="16"/>
+              </w:rPr>
+              <w:t>Glasdegib</w:t>
+            </w:r>
+          </w:p>
+        </w:tc>
+        <w:tc>
+          <w:tcPr>
+            <w:tcW w:type="dxa" w:w="1020"/>
+          </w:tcPr>
+          <w:p>
+            <w:r>
+              <w:rPr>
+                <w:sz w:val="16"/>
+              </w:rPr>
+              <w:t>0.9910</w:t>
+            </w:r>
+          </w:p>
+        </w:tc>
+        <w:tc>
+          <w:tcPr>
+            <w:tcW w:type="dxa" w:w="2835"/>
+          </w:tcPr>
+          <w:p>
+            <w:r>
+              <w:rPr>
+                <w:sz w:val="16"/>
+              </w:rPr>
+              <w:t>oncology drug</w:t>
+            </w:r>
+          </w:p>
+        </w:tc>
+        <w:tc>
+          <w:tcPr>
+            <w:tcW w:type="dxa" w:w="1417"/>
+          </w:tcPr>
+          <w:p>
+            <w:r>
+              <w:rPr>
+                <w:sz w:val="16"/>
+              </w:rPr>
+              <w:t>IMPLAUSIBLE</w:t>
+            </w:r>
+          </w:p>
+        </w:tc>
+      </w:tr>
+      <w:tr>
+        <w:tc>
+          <w:tcPr>
+            <w:tcW w:type="dxa" w:w="2268"/>
+          </w:tcPr>
+          <w:p>
+            <w:r>
+              <w:rPr>
+                <w:sz w:val="16"/>
+              </w:rPr>
+              <w:t>Bempedoic acid</w:t>
+            </w:r>
+          </w:p>
+        </w:tc>
+        <w:tc>
+          <w:tcPr>
+            <w:tcW w:type="dxa" w:w="1020"/>
+          </w:tcPr>
+          <w:p>
+            <w:r>
+              <w:rPr>
+                <w:sz w:val="16"/>
+              </w:rPr>
+              <w:t>0.9910</w:t>
+            </w:r>
+          </w:p>
+        </w:tc>
+        <w:tc>
+          <w:tcPr>
+            <w:tcW w:type="dxa" w:w="2835"/>
+          </w:tcPr>
+          <w:p>
+            <w:r>
+              <w:rPr>
+                <w:sz w:val="16"/>
+              </w:rPr>
+              <w:t>curated CVD treatments</w:t>
+            </w:r>
+          </w:p>
+        </w:tc>
+        <w:tc>
+          <w:tcPr>
+            <w:tcW w:type="dxa" w:w="1417"/>
+          </w:tcPr>
+          <w:p>
+            <w:r>
+              <w:rPr>
+                <w:sz w:val="16"/>
+              </w:rPr>
+              <w:t>PLAUSIBLE</w:t>
+            </w:r>
+          </w:p>
+        </w:tc>
+      </w:tr>
+    </w:tbl>
+    <w:p/>
+    <w:p>
+      <w:r>
+        <w:rPr>
+          <w:b/>
+          <w:sz w:val="22"/>
+        </w:rPr>
+        <w:t>Top 20 Predictions — Myocardial Infarction</w:t>
+      </w:r>
+    </w:p>
+    <w:tbl>
+      <w:tblPr>
+        <w:tblStyle w:val="LightGrid-Accent1"/>
+        <w:tblW w:type="auto" w:w="0"/>
+        <w:jc w:val="center"/>
+        <w:tblLook w:firstColumn="1" w:firstRow="1" w:lastColumn="0" w:lastRow="0" w:noHBand="0" w:noVBand="1" w:val="04A0"/>
+      </w:tblPr>
+      <w:tblGrid>
+        <w:gridCol w:w="2160"/>
+        <w:gridCol w:w="2160"/>
+        <w:gridCol w:w="2160"/>
+        <w:gridCol w:w="2160"/>
+      </w:tblGrid>
+      <w:tr>
+        <w:tc>
+          <w:tcPr>
+            <w:tcW w:type="dxa" w:w="2268"/>
+          </w:tcPr>
+          <w:p>
+            <w:r>
+              <w:rPr>
+                <w:b/>
+                <w:sz w:val="16"/>
+              </w:rPr>
+              <w:t>Drug</w:t>
+            </w:r>
+          </w:p>
+        </w:tc>
+        <w:tc>
+          <w:tcPr>
+            <w:tcW w:type="dxa" w:w="1020"/>
+          </w:tcPr>
+          <w:p>
+            <w:r>
+              <w:rPr>
+                <w:b/>
+                <w:sz w:val="16"/>
+              </w:rPr>
+              <w:t>Confidence</w:t>
+            </w:r>
+          </w:p>
+        </w:tc>
+        <w:tc>
+          <w:tcPr>
+            <w:tcW w:type="dxa" w:w="2835"/>
+          </w:tcPr>
+          <w:p>
+            <w:r>
+              <w:rPr>
+                <w:b/>
+                <w:sz w:val="16"/>
+              </w:rPr>
+              <w:t>Basis</w:t>
+            </w:r>
+          </w:p>
+        </w:tc>
+        <w:tc>
+          <w:tcPr>
+            <w:tcW w:type="dxa" w:w="1417"/>
+          </w:tcPr>
+          <w:p>
+            <w:r>
+              <w:rPr>
+                <w:b/>
+                <w:sz w:val="16"/>
+              </w:rPr>
+              <w:t>Verdict</w:t>
+            </w:r>
+          </w:p>
+        </w:tc>
+      </w:tr>
+      <w:tr>
+        <w:tc>
+          <w:tcPr>
+            <w:tcW w:type="dxa" w:w="2268"/>
+          </w:tcPr>
+          <w:p>
+            <w:r>
+              <w:rPr>
+                <w:sz w:val="16"/>
+              </w:rPr>
+              <w:t>paricalcitol</w:t>
+            </w:r>
+          </w:p>
+        </w:tc>
+        <w:tc>
+          <w:tcPr>
+            <w:tcW w:type="dxa" w:w="1020"/>
+          </w:tcPr>
+          <w:p>
+            <w:r>
+              <w:rPr>
+                <w:sz w:val="16"/>
+              </w:rPr>
+              <w:t>0.9910</w:t>
+            </w:r>
+          </w:p>
+        </w:tc>
+        <w:tc>
+          <w:tcPr>
+            <w:tcW w:type="dxa" w:w="2835"/>
+          </w:tcPr>
+          <w:p>
+            <w:r>
+              <w:rPr>
+                <w:sz w:val="16"/>
+              </w:rPr>
+              <w:t>curated CVD treatments</w:t>
+            </w:r>
+          </w:p>
+        </w:tc>
+        <w:tc>
+          <w:tcPr>
+            <w:tcW w:type="dxa" w:w="1417"/>
+          </w:tcPr>
+          <w:p>
+            <w:r>
+              <w:rPr>
+                <w:sz w:val="16"/>
+              </w:rPr>
+              <w:t>PLAUSIBLE</w:t>
+            </w:r>
+          </w:p>
+        </w:tc>
+      </w:tr>
+      <w:tr>
+        <w:tc>
+          <w:tcPr>
+            <w:tcW w:type="dxa" w:w="2268"/>
+          </w:tcPr>
+          <w:p>
+            <w:r>
+              <w:rPr>
+                <w:sz w:val="16"/>
+              </w:rPr>
+              <w:t>vidarabine</w:t>
+            </w:r>
+          </w:p>
+        </w:tc>
+        <w:tc>
+          <w:tcPr>
+            <w:tcW w:type="dxa" w:w="1020"/>
+          </w:tcPr>
+          <w:p>
+            <w:r>
+              <w:rPr>
+                <w:sz w:val="16"/>
+              </w:rPr>
+              <w:t>0.9910</w:t>
+            </w:r>
+          </w:p>
+        </w:tc>
+        <w:tc>
+          <w:tcPr>
+            <w:tcW w:type="dxa" w:w="2835"/>
+          </w:tcPr>
+          <w:p>
+            <w:r>
+              <w:rPr>
+                <w:sz w:val="16"/>
+              </w:rPr>
+              <w:t>infectious disease drug</w:t>
+            </w:r>
+          </w:p>
+        </w:tc>
+        <w:tc>
+          <w:tcPr>
+            <w:tcW w:type="dxa" w:w="1417"/>
+          </w:tcPr>
+          <w:p>
+            <w:r>
+              <w:rPr>
+                <w:sz w:val="16"/>
+              </w:rPr>
+              <w:t>IMPLAUSIBLE</w:t>
+            </w:r>
+          </w:p>
+        </w:tc>
+      </w:tr>
+      <w:tr>
+        <w:tc>
+          <w:tcPr>
+            <w:tcW w:type="dxa" w:w="2268"/>
+          </w:tcPr>
+          <w:p>
+            <w:r>
+              <w:rPr>
+                <w:sz w:val="16"/>
+              </w:rPr>
+              <w:t>Triamterene</w:t>
+            </w:r>
+          </w:p>
+        </w:tc>
+        <w:tc>
+          <w:tcPr>
+            <w:tcW w:type="dxa" w:w="1020"/>
+          </w:tcPr>
+          <w:p>
+            <w:r>
+              <w:rPr>
+                <w:sz w:val="16"/>
+              </w:rPr>
+              <w:t>0.9910</w:t>
+            </w:r>
+          </w:p>
+        </w:tc>
+        <w:tc>
+          <w:tcPr>
+            <w:tcW w:type="dxa" w:w="2835"/>
+          </w:tcPr>
+          <w:p>
+            <w:r>
+              <w:rPr>
+                <w:sz w:val="16"/>
+              </w:rPr>
+              <w:t>curated CVD treatments</w:t>
+            </w:r>
+          </w:p>
+        </w:tc>
+        <w:tc>
+          <w:tcPr>
+            <w:tcW w:type="dxa" w:w="1417"/>
+          </w:tcPr>
+          <w:p>
+            <w:r>
+              <w:rPr>
+                <w:sz w:val="16"/>
+              </w:rPr>
+              <w:t>PLAUSIBLE</w:t>
+            </w:r>
+          </w:p>
+        </w:tc>
+      </w:tr>
+      <w:tr>
+        <w:tc>
+          <w:tcPr>
+            <w:tcW w:type="dxa" w:w="2268"/>
+          </w:tcPr>
+          <w:p>
+            <w:r>
+              <w:rPr>
+                <w:sz w:val="16"/>
+              </w:rPr>
+              <w:t>Aminophylline</w:t>
+            </w:r>
+          </w:p>
+        </w:tc>
+        <w:tc>
+          <w:tcPr>
+            <w:tcW w:type="dxa" w:w="1020"/>
+          </w:tcPr>
+          <w:p>
+            <w:r>
+              <w:rPr>
+                <w:sz w:val="16"/>
+              </w:rPr>
+              <w:t>0.9910</w:t>
+            </w:r>
+          </w:p>
+        </w:tc>
+        <w:tc>
+          <w:tcPr>
+            <w:tcW w:type="dxa" w:w="2835"/>
+          </w:tcPr>
+          <w:p>
+            <w:r>
+              <w:rPr>
+                <w:sz w:val="16"/>
+              </w:rPr>
+              <w:t>curated CVD treatments</w:t>
+            </w:r>
+          </w:p>
+        </w:tc>
+        <w:tc>
+          <w:tcPr>
+            <w:tcW w:type="dxa" w:w="1417"/>
+          </w:tcPr>
+          <w:p>
+            <w:r>
+              <w:rPr>
+                <w:sz w:val="16"/>
+              </w:rPr>
+              <w:t>PLAUSIBLE</w:t>
+            </w:r>
+          </w:p>
+        </w:tc>
+      </w:tr>
+      <w:tr>
+        <w:tc>
+          <w:tcPr>
+            <w:tcW w:type="dxa" w:w="2268"/>
+          </w:tcPr>
+          <w:p>
+            <w:r>
+              <w:rPr>
+                <w:sz w:val="16"/>
+              </w:rPr>
+              <w:t>ubidecarenone (CoQ10)</w:t>
+            </w:r>
+          </w:p>
+        </w:tc>
+        <w:tc>
+          <w:tcPr>
+            <w:tcW w:type="dxa" w:w="1020"/>
+          </w:tcPr>
+          <w:p>
+            <w:r>
+              <w:rPr>
+                <w:sz w:val="16"/>
+              </w:rPr>
+              <w:t>0.9910</w:t>
+            </w:r>
+          </w:p>
+        </w:tc>
+        <w:tc>
+          <w:tcPr>
+            <w:tcW w:type="dxa" w:w="2835"/>
+          </w:tcPr>
+          <w:p>
+            <w:r>
+              <w:rPr>
+                <w:sz w:val="16"/>
+              </w:rPr>
+              <w:t>curated CVD treatments</w:t>
+            </w:r>
+          </w:p>
+        </w:tc>
+        <w:tc>
+          <w:tcPr>
+            <w:tcW w:type="dxa" w:w="1417"/>
+          </w:tcPr>
+          <w:p>
+            <w:r>
+              <w:rPr>
+                <w:sz w:val="16"/>
+              </w:rPr>
+              <w:t>PLAUSIBLE</w:t>
+            </w:r>
+          </w:p>
+        </w:tc>
+      </w:tr>
+      <w:tr>
+        <w:tc>
+          <w:tcPr>
+            <w:tcW w:type="dxa" w:w="2268"/>
+          </w:tcPr>
+          <w:p>
+            <w:r>
+              <w:rPr>
+                <w:sz w:val="16"/>
+              </w:rPr>
+              <w:t>Folic Acid</w:t>
+            </w:r>
+          </w:p>
+        </w:tc>
+        <w:tc>
+          <w:tcPr>
+            <w:tcW w:type="dxa" w:w="1020"/>
+          </w:tcPr>
+          <w:p>
+            <w:r>
+              <w:rPr>
+                <w:sz w:val="16"/>
+              </w:rPr>
+              <w:t>0.9910</w:t>
+            </w:r>
+          </w:p>
+        </w:tc>
+        <w:tc>
+          <w:tcPr>
+            <w:tcW w:type="dxa" w:w="2835"/>
+          </w:tcPr>
+          <w:p>
+            <w:r>
+              <w:rPr>
+                <w:sz w:val="16"/>
+              </w:rPr>
+              <w:t>curated CVD treatments</w:t>
+            </w:r>
+          </w:p>
+        </w:tc>
+        <w:tc>
+          <w:tcPr>
+            <w:tcW w:type="dxa" w:w="1417"/>
+          </w:tcPr>
+          <w:p>
+            <w:r>
+              <w:rPr>
+                <w:sz w:val="16"/>
+              </w:rPr>
+              <w:t>PLAUSIBLE</w:t>
+            </w:r>
+          </w:p>
+        </w:tc>
+      </w:tr>
+      <w:tr>
+        <w:tc>
+          <w:tcPr>
+            <w:tcW w:type="dxa" w:w="2268"/>
+          </w:tcPr>
+          <w:p>
+            <w:r>
+              <w:rPr>
+                <w:sz w:val="16"/>
+              </w:rPr>
+              <w:t>Azacitidine</w:t>
+            </w:r>
+          </w:p>
+        </w:tc>
+        <w:tc>
+          <w:tcPr>
+            <w:tcW w:type="dxa" w:w="1020"/>
+          </w:tcPr>
+          <w:p>
+            <w:r>
+              <w:rPr>
+                <w:sz w:val="16"/>
+              </w:rPr>
+              <w:t>0.9910</w:t>
+            </w:r>
+          </w:p>
+        </w:tc>
+        <w:tc>
+          <w:tcPr>
+            <w:tcW w:type="dxa" w:w="2835"/>
+          </w:tcPr>
+          <w:p>
+            <w:r>
+              <w:rPr>
+                <w:sz w:val="16"/>
+              </w:rPr>
+              <w:t>oncology drug</w:t>
+            </w:r>
+          </w:p>
+        </w:tc>
+        <w:tc>
+          <w:tcPr>
+            <w:tcW w:type="dxa" w:w="1417"/>
+          </w:tcPr>
+          <w:p>
+            <w:r>
+              <w:rPr>
+                <w:sz w:val="16"/>
+              </w:rPr>
+              <w:t>IMPLAUSIBLE</w:t>
+            </w:r>
+          </w:p>
+        </w:tc>
+      </w:tr>
+      <w:tr>
+        <w:tc>
+          <w:tcPr>
+            <w:tcW w:type="dxa" w:w="2268"/>
+          </w:tcPr>
+          <w:p>
+            <w:r>
+              <w:rPr>
+                <w:sz w:val="16"/>
+              </w:rPr>
+              <w:t>Adrenal Cortex Hormones</w:t>
+            </w:r>
+          </w:p>
+        </w:tc>
+        <w:tc>
+          <w:tcPr>
+            <w:tcW w:type="dxa" w:w="1020"/>
+          </w:tcPr>
+          <w:p>
+            <w:r>
+              <w:rPr>
+                <w:sz w:val="16"/>
+              </w:rPr>
+              <w:t>0.9910</w:t>
+            </w:r>
+          </w:p>
+        </w:tc>
+        <w:tc>
+          <w:tcPr>
+            <w:tcW w:type="dxa" w:w="2835"/>
+          </w:tcPr>
+          <w:p>
+            <w:r>
+              <w:rPr>
+                <w:sz w:val="16"/>
+              </w:rPr>
+              <w:t>curated CVD treatments</w:t>
+            </w:r>
+          </w:p>
+        </w:tc>
+        <w:tc>
+          <w:tcPr>
+            <w:tcW w:type="dxa" w:w="1417"/>
+          </w:tcPr>
+          <w:p>
+            <w:r>
+              <w:rPr>
+                <w:sz w:val="16"/>
+              </w:rPr>
+              <w:t>PLAUSIBLE</w:t>
+            </w:r>
+          </w:p>
+        </w:tc>
+      </w:tr>
+      <w:tr>
+        <w:tc>
+          <w:tcPr>
+            <w:tcW w:type="dxa" w:w="2268"/>
+          </w:tcPr>
+          <w:p>
+            <w:r>
+              <w:rPr>
+                <w:sz w:val="16"/>
+              </w:rPr>
+              <w:t>Sildenafil Citrate</w:t>
+            </w:r>
+          </w:p>
+        </w:tc>
+        <w:tc>
+          <w:tcPr>
+            <w:tcW w:type="dxa" w:w="1020"/>
+          </w:tcPr>
+          <w:p>
+            <w:r>
+              <w:rPr>
+                <w:sz w:val="16"/>
+              </w:rPr>
+              <w:t>0.9910</w:t>
+            </w:r>
+          </w:p>
+        </w:tc>
+        <w:tc>
+          <w:tcPr>
+            <w:tcW w:type="dxa" w:w="2835"/>
+          </w:tcPr>
+          <w:p>
+            <w:r>
+              <w:rPr>
+                <w:sz w:val="16"/>
+              </w:rPr>
+              <w:t>curated CVD treatments</w:t>
+            </w:r>
+          </w:p>
+        </w:tc>
+        <w:tc>
+          <w:tcPr>
+            <w:tcW w:type="dxa" w:w="1417"/>
+          </w:tcPr>
+          <w:p>
+            <w:r>
+              <w:rPr>
+                <w:sz w:val="16"/>
+              </w:rPr>
+              <w:t>PLAUSIBLE</w:t>
+            </w:r>
+          </w:p>
+        </w:tc>
+      </w:tr>
+      <w:tr>
+        <w:tc>
+          <w:tcPr>
+            <w:tcW w:type="dxa" w:w="2268"/>
+          </w:tcPr>
+          <w:p>
+            <w:r>
+              <w:rPr>
+                <w:sz w:val="16"/>
+              </w:rPr>
+              <w:t>Diltiazem</w:t>
+            </w:r>
+          </w:p>
+        </w:tc>
+        <w:tc>
+          <w:tcPr>
+            <w:tcW w:type="dxa" w:w="1020"/>
+          </w:tcPr>
+          <w:p>
+            <w:r>
+              <w:rPr>
+                <w:sz w:val="16"/>
+              </w:rPr>
+              <w:t>0.9910</w:t>
+            </w:r>
+          </w:p>
+        </w:tc>
+        <w:tc>
+          <w:tcPr>
+            <w:tcW w:type="dxa" w:w="2835"/>
+          </w:tcPr>
+          <w:p>
+            <w:r>
+              <w:rPr>
+                <w:sz w:val="16"/>
+              </w:rPr>
+              <w:t>curated CVD treatments</w:t>
+            </w:r>
+          </w:p>
+        </w:tc>
+        <w:tc>
+          <w:tcPr>
+            <w:tcW w:type="dxa" w:w="1417"/>
+          </w:tcPr>
+          <w:p>
+            <w:r>
+              <w:rPr>
+                <w:sz w:val="16"/>
+              </w:rPr>
+              <w:t>PLAUSIBLE</w:t>
+            </w:r>
+          </w:p>
+        </w:tc>
+      </w:tr>
+      <w:tr>
+        <w:tc>
+          <w:tcPr>
+            <w:tcW w:type="dxa" w:w="2268"/>
+          </w:tcPr>
+          <w:p>
+            <w:r>
+              <w:rPr>
+                <w:sz w:val="16"/>
+              </w:rPr>
+              <w:t>Ceftobiprole</w:t>
+            </w:r>
+          </w:p>
+        </w:tc>
+        <w:tc>
+          <w:tcPr>
+            <w:tcW w:type="dxa" w:w="1020"/>
+          </w:tcPr>
+          <w:p>
+            <w:r>
+              <w:rPr>
+                <w:sz w:val="16"/>
+              </w:rPr>
+              <w:t>0.9910</w:t>
+            </w:r>
+          </w:p>
+        </w:tc>
+        <w:tc>
+          <w:tcPr>
+            <w:tcW w:type="dxa" w:w="2835"/>
+          </w:tcPr>
+          <w:p>
+            <w:r>
+              <w:rPr>
+                <w:sz w:val="16"/>
+              </w:rPr>
+              <w:t>curated CVD treatments</w:t>
+            </w:r>
+          </w:p>
+        </w:tc>
+        <w:tc>
+          <w:tcPr>
+            <w:tcW w:type="dxa" w:w="1417"/>
+          </w:tcPr>
+          <w:p>
+            <w:r>
+              <w:rPr>
+                <w:sz w:val="16"/>
+              </w:rPr>
+              <w:t>PLAUSIBLE</w:t>
+            </w:r>
+          </w:p>
+        </w:tc>
+      </w:tr>
+      <w:tr>
+        <w:tc>
+          <w:tcPr>
+            <w:tcW w:type="dxa" w:w="2268"/>
+          </w:tcPr>
+          <w:p>
+            <w:r>
+              <w:rPr>
+                <w:sz w:val="16"/>
+              </w:rPr>
+              <w:t>Estrogens, Conjugated</w:t>
+            </w:r>
+          </w:p>
+        </w:tc>
+        <w:tc>
+          <w:tcPr>
+            <w:tcW w:type="dxa" w:w="1020"/>
+          </w:tcPr>
+          <w:p>
+            <w:r>
+              <w:rPr>
+                <w:sz w:val="16"/>
+              </w:rPr>
+              <w:t>0.9910</w:t>
+            </w:r>
+          </w:p>
+        </w:tc>
+        <w:tc>
+          <w:tcPr>
+            <w:tcW w:type="dxa" w:w="2835"/>
+          </w:tcPr>
+          <w:p>
+            <w:r>
+              <w:rPr>
+                <w:sz w:val="16"/>
+              </w:rPr>
+              <w:t>curated CVD treatments</w:t>
+            </w:r>
+          </w:p>
+        </w:tc>
+        <w:tc>
+          <w:tcPr>
+            <w:tcW w:type="dxa" w:w="1417"/>
+          </w:tcPr>
+          <w:p>
+            <w:r>
+              <w:rPr>
+                <w:sz w:val="16"/>
+              </w:rPr>
+              <w:t>PLAUSIBLE</w:t>
+            </w:r>
+          </w:p>
+        </w:tc>
+      </w:tr>
+      <w:tr>
+        <w:tc>
+          <w:tcPr>
+            <w:tcW w:type="dxa" w:w="2268"/>
+          </w:tcPr>
+          <w:p>
+            <w:r>
+              <w:rPr>
+                <w:sz w:val="16"/>
+              </w:rPr>
+              <w:t>Magnesium</w:t>
+            </w:r>
+          </w:p>
+        </w:tc>
+        <w:tc>
+          <w:tcPr>
+            <w:tcW w:type="dxa" w:w="1020"/>
+          </w:tcPr>
+          <w:p>
+            <w:r>
+              <w:rPr>
+                <w:sz w:val="16"/>
+              </w:rPr>
+              <w:t>0.9910</w:t>
+            </w:r>
+          </w:p>
+        </w:tc>
+        <w:tc>
+          <w:tcPr>
+            <w:tcW w:type="dxa" w:w="2835"/>
+          </w:tcPr>
+          <w:p>
+            <w:r>
+              <w:rPr>
+                <w:sz w:val="16"/>
+              </w:rPr>
+              <w:t>curated CVD treatments</w:t>
+            </w:r>
+          </w:p>
+        </w:tc>
+        <w:tc>
+          <w:tcPr>
+            <w:tcW w:type="dxa" w:w="1417"/>
+          </w:tcPr>
+          <w:p>
+            <w:r>
+              <w:rPr>
+                <w:sz w:val="16"/>
+              </w:rPr>
+              <w:t>PLAUSIBLE</w:t>
+            </w:r>
+          </w:p>
+        </w:tc>
+      </w:tr>
+      <w:tr>
+        <w:tc>
+          <w:tcPr>
+            <w:tcW w:type="dxa" w:w="2268"/>
+          </w:tcPr>
+          <w:p>
+            <w:r>
+              <w:rPr>
+                <w:sz w:val="16"/>
+              </w:rPr>
+              <w:t>Benzylpenicillin</w:t>
+            </w:r>
+          </w:p>
+        </w:tc>
+        <w:tc>
+          <w:tcPr>
+            <w:tcW w:type="dxa" w:w="1020"/>
+          </w:tcPr>
+          <w:p>
+            <w:r>
+              <w:rPr>
+                <w:sz w:val="16"/>
+              </w:rPr>
+              <w:t>0.9910</w:t>
+            </w:r>
+          </w:p>
+        </w:tc>
+        <w:tc>
+          <w:tcPr>
+            <w:tcW w:type="dxa" w:w="2835"/>
+          </w:tcPr>
+          <w:p>
+            <w:r>
+              <w:rPr>
+                <w:sz w:val="16"/>
+              </w:rPr>
+              <w:t>curated CVD treatments</w:t>
+            </w:r>
+          </w:p>
+        </w:tc>
+        <w:tc>
+          <w:tcPr>
+            <w:tcW w:type="dxa" w:w="1417"/>
+          </w:tcPr>
+          <w:p>
+            <w:r>
+              <w:rPr>
+                <w:sz w:val="16"/>
+              </w:rPr>
+              <w:t>PLAUSIBLE</w:t>
+            </w:r>
+          </w:p>
+        </w:tc>
+      </w:tr>
+      <w:tr>
+        <w:tc>
+          <w:tcPr>
+            <w:tcW w:type="dxa" w:w="2268"/>
+          </w:tcPr>
+          <w:p>
+            <w:r>
+              <w:rPr>
+                <w:sz w:val="16"/>
+              </w:rPr>
+              <w:t>Quizartinib</w:t>
+            </w:r>
+          </w:p>
+        </w:tc>
+        <w:tc>
+          <w:tcPr>
+            <w:tcW w:type="dxa" w:w="1020"/>
+          </w:tcPr>
+          <w:p>
+            <w:r>
+              <w:rPr>
+                <w:sz w:val="16"/>
+              </w:rPr>
+              <w:t>0.9910</w:t>
+            </w:r>
+          </w:p>
+        </w:tc>
+        <w:tc>
+          <w:tcPr>
+            <w:tcW w:type="dxa" w:w="2835"/>
+          </w:tcPr>
+          <w:p>
+            <w:r>
+              <w:rPr>
+                <w:sz w:val="16"/>
+              </w:rPr>
+              <w:t>oncology drug</w:t>
+            </w:r>
+          </w:p>
+        </w:tc>
+        <w:tc>
+          <w:tcPr>
+            <w:tcW w:type="dxa" w:w="1417"/>
+          </w:tcPr>
+          <w:p>
+            <w:r>
+              <w:rPr>
+                <w:sz w:val="16"/>
+              </w:rPr>
+              <w:t>IMPLAUSIBLE</w:t>
+            </w:r>
+          </w:p>
+        </w:tc>
+      </w:tr>
+      <w:tr>
+        <w:tc>
+          <w:tcPr>
+            <w:tcW w:type="dxa" w:w="2268"/>
+          </w:tcPr>
+          <w:p>
+            <w:r>
+              <w:rPr>
+                <w:sz w:val="16"/>
+              </w:rPr>
+              <w:t>Cyanocobalamin</w:t>
+            </w:r>
+          </w:p>
+        </w:tc>
+        <w:tc>
+          <w:tcPr>
+            <w:tcW w:type="dxa" w:w="1020"/>
+          </w:tcPr>
+          <w:p>
+            <w:r>
+              <w:rPr>
+                <w:sz w:val="16"/>
+              </w:rPr>
+              <w:t>0.9910</w:t>
+            </w:r>
+          </w:p>
+        </w:tc>
+        <w:tc>
+          <w:tcPr>
+            <w:tcW w:type="dxa" w:w="2835"/>
+          </w:tcPr>
+          <w:p>
+            <w:r>
+              <w:rPr>
+                <w:sz w:val="16"/>
+              </w:rPr>
+              <w:t>anemia drug — indirect CVD link</w:t>
+            </w:r>
+          </w:p>
+        </w:tc>
+        <w:tc>
+          <w:tcPr>
+            <w:tcW w:type="dxa" w:w="1417"/>
+          </w:tcPr>
+          <w:p>
+            <w:r>
+              <w:rPr>
+                <w:sz w:val="16"/>
+              </w:rPr>
+              <w:t>AMBIGUOUS</w:t>
+            </w:r>
+          </w:p>
+        </w:tc>
+      </w:tr>
+      <w:tr>
+        <w:tc>
+          <w:tcPr>
+            <w:tcW w:type="dxa" w:w="2268"/>
+          </w:tcPr>
+          <w:p>
+            <w:r>
+              <w:rPr>
+                <w:sz w:val="16"/>
+              </w:rPr>
+              <w:t>Anthralin</w:t>
+            </w:r>
+          </w:p>
+        </w:tc>
+        <w:tc>
+          <w:tcPr>
+            <w:tcW w:type="dxa" w:w="1020"/>
+          </w:tcPr>
+          <w:p>
+            <w:r>
+              <w:rPr>
+                <w:sz w:val="16"/>
+              </w:rPr>
+              <w:t>0.9909</w:t>
+            </w:r>
+          </w:p>
+        </w:tc>
+        <w:tc>
+          <w:tcPr>
+            <w:tcW w:type="dxa" w:w="2835"/>
+          </w:tcPr>
+          <w:p>
+            <w:r>
+              <w:rPr>
+                <w:sz w:val="16"/>
+              </w:rPr>
+              <w:t>dermatology drug</w:t>
+            </w:r>
+          </w:p>
+        </w:tc>
+        <w:tc>
+          <w:tcPr>
+            <w:tcW w:type="dxa" w:w="1417"/>
+          </w:tcPr>
+          <w:p>
+            <w:r>
+              <w:rPr>
+                <w:sz w:val="16"/>
+              </w:rPr>
+              <w:t>IMPLAUSIBLE</w:t>
+            </w:r>
+          </w:p>
+        </w:tc>
+      </w:tr>
+      <w:tr>
+        <w:tc>
+          <w:tcPr>
+            <w:tcW w:type="dxa" w:w="2268"/>
+          </w:tcPr>
+          <w:p>
+            <w:r>
+              <w:rPr>
+                <w:sz w:val="16"/>
+              </w:rPr>
+              <w:t>Alfimeprase</w:t>
+            </w:r>
+          </w:p>
+        </w:tc>
+        <w:tc>
+          <w:tcPr>
+            <w:tcW w:type="dxa" w:w="1020"/>
+          </w:tcPr>
+          <w:p>
+            <w:r>
+              <w:rPr>
+                <w:sz w:val="16"/>
+              </w:rPr>
+              <w:t>0.9909</w:t>
+            </w:r>
+          </w:p>
+        </w:tc>
+        <w:tc>
+          <w:tcPr>
+            <w:tcW w:type="dxa" w:w="2835"/>
+          </w:tcPr>
+          <w:p>
+            <w:r>
+              <w:rPr>
+                <w:sz w:val="16"/>
+              </w:rPr>
+              <w:t>curated CVD treatments</w:t>
+            </w:r>
+          </w:p>
+        </w:tc>
+        <w:tc>
+          <w:tcPr>
+            <w:tcW w:type="dxa" w:w="1417"/>
+          </w:tcPr>
+          <w:p>
+            <w:r>
+              <w:rPr>
+                <w:sz w:val="16"/>
+              </w:rPr>
+              <w:t>PLAUSIBLE</w:t>
+            </w:r>
+          </w:p>
+        </w:tc>
+      </w:tr>
+      <w:tr>
+        <w:tc>
+          <w:tcPr>
+            <w:tcW w:type="dxa" w:w="2268"/>
+          </w:tcPr>
+          <w:p>
+            <w:r>
+              <w:rPr>
+                <w:sz w:val="16"/>
+              </w:rPr>
+              <w:t>Propylthiouracil</w:t>
+            </w:r>
+          </w:p>
+        </w:tc>
+        <w:tc>
+          <w:tcPr>
+            <w:tcW w:type="dxa" w:w="1020"/>
+          </w:tcPr>
+          <w:p>
+            <w:r>
+              <w:rPr>
+                <w:sz w:val="16"/>
+              </w:rPr>
+              <w:t>0.9908</w:t>
+            </w:r>
+          </w:p>
+        </w:tc>
+        <w:tc>
+          <w:tcPr>
+            <w:tcW w:type="dxa" w:w="2835"/>
+          </w:tcPr>
+          <w:p>
+            <w:r>
+              <w:rPr>
+                <w:sz w:val="16"/>
+              </w:rPr>
+              <w:t>curated CVD treatments</w:t>
+            </w:r>
+          </w:p>
+        </w:tc>
+        <w:tc>
+          <w:tcPr>
+            <w:tcW w:type="dxa" w:w="1417"/>
+          </w:tcPr>
+          <w:p>
+            <w:r>
+              <w:rPr>
+                <w:sz w:val="16"/>
+              </w:rPr>
+              <w:t>PLAUSIBLE</w:t>
+            </w:r>
+          </w:p>
+        </w:tc>
+      </w:tr>
+      <w:tr>
+        <w:tc>
+          <w:tcPr>
+            <w:tcW w:type="dxa" w:w="2268"/>
+          </w:tcPr>
+          <w:p>
+            <w:r>
+              <w:rPr>
+                <w:sz w:val="16"/>
+              </w:rPr>
+              <w:t>netarsudil</w:t>
+            </w:r>
+          </w:p>
+        </w:tc>
+        <w:tc>
+          <w:tcPr>
+            <w:tcW w:type="dxa" w:w="1020"/>
+          </w:tcPr>
+          <w:p>
+            <w:r>
+              <w:rPr>
+                <w:sz w:val="16"/>
+              </w:rPr>
+              <w:t>0.9908</w:t>
+            </w:r>
+          </w:p>
+        </w:tc>
+        <w:tc>
+          <w:tcPr>
+            <w:tcW w:type="dxa" w:w="2835"/>
+          </w:tcPr>
+          <w:p>
+            <w:r>
+              <w:rPr>
+                <w:sz w:val="16"/>
+              </w:rPr>
+              <w:t>curated CVD treatments</w:t>
+            </w:r>
+          </w:p>
+        </w:tc>
+        <w:tc>
+          <w:tcPr>
+            <w:tcW w:type="dxa" w:w="1417"/>
+          </w:tcPr>
+          <w:p>
+            <w:r>
+              <w:rPr>
+                <w:sz w:val="16"/>
+              </w:rPr>
+              <w:t>PLAUSIBLE</w:t>
+            </w:r>
+          </w:p>
+        </w:tc>
+      </w:tr>
+    </w:tbl>
+    <w:p/>
+    <w:p>
+      <w:r>
+        <w:rPr>
+          <w:b/>
+          <w:sz w:val="22"/>
+        </w:rPr>
+        <w:t>Key Findings</w:t>
+      </w:r>
+    </w:p>
+    <w:p>
+      <w:pPr>
+        <w:pStyle w:val="ListBullet"/>
+        <w:ind w:left="720"/>
+      </w:pPr>
+      <w:r>
+        <w:t>89.2% of top predictions are plausible or ambiguous — the model strongly favors drugs with existing CVD therapeutic profiles.</w:t>
+      </w:r>
+    </w:p>
+    <w:p>
+      <w:pPr>
+        <w:pStyle w:val="ListBullet"/>
+        <w:ind w:left="720"/>
+      </w:pPr>
+      <w:r>
+        <w:t>Heart disease and coronary artery disease are the cleanest (0-5% implausible), dominated by ACE inhibitors, statins, anticoagulants, and beta-blockers.</w:t>
+      </w:r>
+    </w:p>
+    <w:p>
+      <w:pPr>
+        <w:pStyle w:val="ListBullet"/>
+        <w:ind w:left="720"/>
+      </w:pPr>
+      <w:r>
+        <w:t>Hypertension is the noisiest (25% implausible) — oncology drugs Cytarabine, Gilteritinib, and Glasdegib appear, likely because high-degree leukemia drugs share gene targets (kinase inhibitors) with antihypertensives.</w:t>
+      </w:r>
+    </w:p>
+    <w:p>
+      <w:pPr>
+        <w:pStyle w:val="ListBullet"/>
+        <w:ind w:left="720"/>
+      </w:pPr>
+      <w:r>
+        <w:t>Repeat offenders: serdexmethylphenidate (ADHD stimulant) and Azacitidine (AML drug) each appear across 2-3 diseases — these are hub drugs with high graph degree pulling them into predictions.</w:t>
+      </w:r>
+    </w:p>
+    <w:p>
+      <w:pPr>
+        <w:pStyle w:val="ListBullet"/>
+        <w:ind w:left="720"/>
+      </w:pPr>
+      <w:r>
+        <w:t>Ambiguous cases (ferric derisomaltose, Cyanocobalamin, Sodium Chloride) have indirect CVD links through anemia/electrolyte pathways — not clearly wrong but not strongly supported.</w:t>
+      </w:r>
+    </w:p>
+    <w:sectPr>
+      <w:pgSz w:w="12240" w:h="15840"/>
+      <w:pgMar w:top="1440" w:right="1800" w:bottom="1440" w:left="1800" w:header="720" w:footer="720" w:gutter="0"/>
+      <w:cols w:space="720"/>
+      <w:docGrid w:linePitch="360"/>
+    </w:sectPr>
     <w:p>
       <w:pPr>
         <w:spacing w:after="40"/>

</xml_diff>